<commit_message>
Quitar la pregunta al público y el reparto entre expositores
La exposición la hace una sola persona, así que se elimina la columna de
expositores de la tabla y las marcas de nombre por diapositiva, y todo el
guion queda en primera persona del singular: cierro, respondo, me parece.

La apertura ya no interpela al público. Arranca con la observación directa
de que el local de una cadena conocida casi nunca es de la marca, que
lleva al mismo punto sin pedirle nada a la audiencia.
</commit_message>
<xml_diff>
--- a/Guion exposicion - Contrato de franquicia.docx
+++ b/Guion exposicion - Contrato de franquicia.docx
@@ -50,7 +50,7 @@
           <w:color w:val="707886"/>
           <w:sz w:val="22"/>
         </w:rPr>
-        <w:t>El video de la entrevista va después de los quince minutos, así que estos quince son de exposición hablada. La diapositiva 6 cierra la exposición y deja el video montado. Leído a ritmo normal, unas 140 palabras por minuto, el guion completo da 14:54.</w:t>
+        <w:t>El video de la entrevista va después de los quince minutos, así que estos quince son de exposición hablada. La diapositiva 6 cierra la exposición y deja el video montado. Leído a ritmo normal, unas 140 palabras por minuto, el guion completo da 14:53.</w:t>
       </w:r>
     </w:p>
     <w:tbl>
@@ -60,15 +60,14 @@
         <w:tblLook w:firstColumn="1" w:firstRow="1" w:lastColumn="0" w:lastRow="0" w:noHBand="0" w:noVBand="1" w:val="04A0"/>
       </w:tblPr>
       <w:tblGrid>
-        <w:gridCol w:w="2408"/>
-        <w:gridCol w:w="2408"/>
-        <w:gridCol w:w="2408"/>
-        <w:gridCol w:w="2408"/>
+        <w:gridCol w:w="3211"/>
+        <w:gridCol w:w="3211"/>
+        <w:gridCol w:w="3211"/>
       </w:tblGrid>
       <w:tr>
         <w:tc>
           <w:tcPr>
-            <w:tcW w:type="dxa" w:w="1134"/>
+            <w:tcW w:type="dxa" w:w="1361"/>
             <w:shd w:val="clear" w:fill="1B2A41"/>
           </w:tcPr>
           <w:p>
@@ -88,7 +87,7 @@
         </w:tc>
         <w:tc>
           <w:tcPr>
-            <w:tcW w:type="dxa" w:w="3742"/>
+            <w:tcW w:type="dxa" w:w="4876"/>
             <w:shd w:val="clear" w:fill="1B2A41"/>
           </w:tcPr>
           <w:p>
@@ -108,7 +107,7 @@
         </w:tc>
         <w:tc>
           <w:tcPr>
-            <w:tcW w:type="dxa" w:w="1247"/>
+            <w:tcW w:type="dxa" w:w="1361"/>
             <w:shd w:val="clear" w:fill="1B2A41"/>
           </w:tcPr>
           <w:p>
@@ -126,31 +125,11 @@
             </w:r>
           </w:p>
         </w:tc>
-        <w:tc>
-          <w:tcPr>
-            <w:tcW w:type="dxa" w:w="2381"/>
-            <w:shd w:val="clear" w:fill="1B2A41"/>
-          </w:tcPr>
-          <w:p>
-            <w:pPr>
-              <w:spacing w:after="0"/>
-            </w:pPr>
-            <w:r>
-              <w:rPr>
-                <w:rFonts w:ascii="Calibri" w:hAnsi="Calibri"/>
-                <w:b/>
-                <w:color w:val="FFFFFF"/>
-                <w:sz w:val="17"/>
-              </w:rPr>
-              <w:t>EXPONE</w:t>
-            </w:r>
-          </w:p>
-        </w:tc>
       </w:tr>
       <w:tr>
         <w:tc>
           <w:tcPr>
-            <w:tcW w:type="dxa" w:w="1134"/>
+            <w:tcW w:type="dxa" w:w="1361"/>
             <w:tcBorders>
               <w:top w:val="nil"/>
               <w:left w:val="nil"/>
@@ -174,7 +153,7 @@
         </w:tc>
         <w:tc>
           <w:tcPr>
-            <w:tcW w:type="dxa" w:w="3742"/>
+            <w:tcW w:type="dxa" w:w="4876"/>
             <w:tcBorders>
               <w:top w:val="nil"/>
               <w:left w:val="nil"/>
@@ -198,7 +177,7 @@
         </w:tc>
         <w:tc>
           <w:tcPr>
-            <w:tcW w:type="dxa" w:w="1247"/>
+            <w:tcW w:type="dxa" w:w="1361"/>
             <w:tcBorders>
               <w:top w:val="nil"/>
               <w:left w:val="nil"/>
@@ -216,13 +195,15 @@
                 <w:color w:val="1B2A41"/>
                 <w:sz w:val="20"/>
               </w:rPr>
-              <w:t>1:01</w:t>
+              <w:t>1:04</w:t>
             </w:r>
           </w:p>
         </w:tc>
+      </w:tr>
+      <w:tr>
         <w:tc>
           <w:tcPr>
-            <w:tcW w:type="dxa" w:w="2381"/>
+            <w:tcW w:type="dxa" w:w="1361"/>
             <w:tcBorders>
               <w:top w:val="nil"/>
               <w:left w:val="nil"/>
@@ -240,39 +221,13 @@
                 <w:color w:val="1B2A41"/>
                 <w:sz w:val="20"/>
               </w:rPr>
-              <w:t>Fredy</w:t>
-            </w:r>
-          </w:p>
-        </w:tc>
-      </w:tr>
-      <w:tr>
-        <w:tc>
-          <w:tcPr>
-            <w:tcW w:type="dxa" w:w="1134"/>
-            <w:tcBorders>
-              <w:top w:val="nil"/>
-              <w:left w:val="nil"/>
-              <w:right w:val="nil"/>
-              <w:bottom w:val="single" w:sz="4" w:color="D8D4CC"/>
-            </w:tcBorders>
-          </w:tcPr>
-          <w:p>
-            <w:pPr>
-              <w:spacing w:after="0"/>
-            </w:pPr>
-            <w:r>
-              <w:rPr>
-                <w:rFonts w:ascii="Calibri" w:hAnsi="Calibri"/>
-                <w:color w:val="1B2A41"/>
-                <w:sz w:val="20"/>
-              </w:rPr>
-              <w:t>1:01</w:t>
+              <w:t>1:04</w:t>
             </w:r>
           </w:p>
         </w:tc>
         <w:tc>
           <w:tcPr>
-            <w:tcW w:type="dxa" w:w="3742"/>
+            <w:tcW w:type="dxa" w:w="4876"/>
             <w:tcBorders>
               <w:top w:val="nil"/>
               <w:left w:val="nil"/>
@@ -296,7 +251,7 @@
         </w:tc>
         <w:tc>
           <w:tcPr>
-            <w:tcW w:type="dxa" w:w="1247"/>
+            <w:tcW w:type="dxa" w:w="1361"/>
             <w:tcBorders>
               <w:top w:val="nil"/>
               <w:left w:val="nil"/>
@@ -318,9 +273,11 @@
             </w:r>
           </w:p>
         </w:tc>
+      </w:tr>
+      <w:tr>
         <w:tc>
           <w:tcPr>
-            <w:tcW w:type="dxa" w:w="2381"/>
+            <w:tcW w:type="dxa" w:w="1361"/>
             <w:tcBorders>
               <w:top w:val="nil"/>
               <w:left w:val="nil"/>
@@ -338,39 +295,13 @@
                 <w:color w:val="1B2A41"/>
                 <w:sz w:val="20"/>
               </w:rPr>
-              <w:t>Fredy</w:t>
-            </w:r>
-          </w:p>
-        </w:tc>
-      </w:tr>
-      <w:tr>
-        <w:tc>
-          <w:tcPr>
-            <w:tcW w:type="dxa" w:w="1134"/>
-            <w:tcBorders>
-              <w:top w:val="nil"/>
-              <w:left w:val="nil"/>
-              <w:right w:val="nil"/>
-              <w:bottom w:val="single" w:sz="4" w:color="D8D4CC"/>
-            </w:tcBorders>
-          </w:tcPr>
-          <w:p>
-            <w:pPr>
-              <w:spacing w:after="0"/>
-            </w:pPr>
-            <w:r>
-              <w:rPr>
-                <w:rFonts w:ascii="Calibri" w:hAnsi="Calibri"/>
-                <w:color w:val="1B2A41"/>
-                <w:sz w:val="20"/>
-              </w:rPr>
-              <w:t>4:31</w:t>
+              <w:t>4:34</w:t>
             </w:r>
           </w:p>
         </w:tc>
         <w:tc>
           <w:tcPr>
-            <w:tcW w:type="dxa" w:w="3742"/>
+            <w:tcW w:type="dxa" w:w="4876"/>
             <w:tcBorders>
               <w:top w:val="nil"/>
               <w:left w:val="nil"/>
@@ -394,7 +325,7 @@
         </w:tc>
         <w:tc>
           <w:tcPr>
-            <w:tcW w:type="dxa" w:w="1247"/>
+            <w:tcW w:type="dxa" w:w="1361"/>
             <w:tcBorders>
               <w:top w:val="nil"/>
               <w:left w:val="nil"/>
@@ -412,13 +343,15 @@
                 <w:color w:val="1B2A41"/>
                 <w:sz w:val="20"/>
               </w:rPr>
-              <w:t>2:46</w:t>
+              <w:t>2:45</w:t>
             </w:r>
           </w:p>
         </w:tc>
+      </w:tr>
+      <w:tr>
         <w:tc>
           <w:tcPr>
-            <w:tcW w:type="dxa" w:w="2381"/>
+            <w:tcW w:type="dxa" w:w="1361"/>
             <w:tcBorders>
               <w:top w:val="nil"/>
               <w:left w:val="nil"/>
@@ -436,39 +369,13 @@
                 <w:color w:val="1B2A41"/>
                 <w:sz w:val="20"/>
               </w:rPr>
-              <w:t>María Isabel</w:t>
-            </w:r>
-          </w:p>
-        </w:tc>
-      </w:tr>
-      <w:tr>
-        <w:tc>
-          <w:tcPr>
-            <w:tcW w:type="dxa" w:w="1134"/>
-            <w:tcBorders>
-              <w:top w:val="nil"/>
-              <w:left w:val="nil"/>
-              <w:right w:val="nil"/>
-              <w:bottom w:val="single" w:sz="4" w:color="D8D4CC"/>
-            </w:tcBorders>
-          </w:tcPr>
-          <w:p>
-            <w:pPr>
-              <w:spacing w:after="0"/>
-            </w:pPr>
-            <w:r>
-              <w:rPr>
-                <w:rFonts w:ascii="Calibri" w:hAnsi="Calibri"/>
-                <w:color w:val="1B2A41"/>
-                <w:sz w:val="20"/>
-              </w:rPr>
-              <w:t>7:18</w:t>
+              <w:t>7:20</w:t>
             </w:r>
           </w:p>
         </w:tc>
         <w:tc>
           <w:tcPr>
-            <w:tcW w:type="dxa" w:w="3742"/>
+            <w:tcW w:type="dxa" w:w="4876"/>
             <w:tcBorders>
               <w:top w:val="nil"/>
               <w:left w:val="nil"/>
@@ -492,7 +399,7 @@
         </w:tc>
         <w:tc>
           <w:tcPr>
-            <w:tcW w:type="dxa" w:w="1247"/>
+            <w:tcW w:type="dxa" w:w="1361"/>
             <w:tcBorders>
               <w:top w:val="nil"/>
               <w:left w:val="nil"/>
@@ -510,13 +417,15 @@
                 <w:color w:val="1B2A41"/>
                 <w:sz w:val="20"/>
               </w:rPr>
-              <w:t>3:16</w:t>
+              <w:t>3:15</w:t>
             </w:r>
           </w:p>
         </w:tc>
+      </w:tr>
+      <w:tr>
         <w:tc>
           <w:tcPr>
-            <w:tcW w:type="dxa" w:w="2381"/>
+            <w:tcW w:type="dxa" w:w="1361"/>
             <w:tcBorders>
               <w:top w:val="nil"/>
               <w:left w:val="nil"/>
@@ -534,39 +443,13 @@
                 <w:color w:val="1B2A41"/>
                 <w:sz w:val="20"/>
               </w:rPr>
-              <w:t>Xilena</w:t>
-            </w:r>
-          </w:p>
-        </w:tc>
-      </w:tr>
-      <w:tr>
-        <w:tc>
-          <w:tcPr>
-            <w:tcW w:type="dxa" w:w="1134"/>
-            <w:tcBorders>
-              <w:top w:val="nil"/>
-              <w:left w:val="nil"/>
-              <w:right w:val="nil"/>
-              <w:bottom w:val="single" w:sz="4" w:color="D8D4CC"/>
-            </w:tcBorders>
-          </w:tcPr>
-          <w:p>
-            <w:pPr>
-              <w:spacing w:after="0"/>
-            </w:pPr>
-            <w:r>
-              <w:rPr>
-                <w:rFonts w:ascii="Calibri" w:hAnsi="Calibri"/>
-                <w:color w:val="1B2A41"/>
-                <w:sz w:val="20"/>
-              </w:rPr>
-              <w:t>10:34</w:t>
+              <w:t>10:35</w:t>
             </w:r>
           </w:p>
         </w:tc>
         <w:tc>
           <w:tcPr>
-            <w:tcW w:type="dxa" w:w="3742"/>
+            <w:tcW w:type="dxa" w:w="4876"/>
             <w:tcBorders>
               <w:top w:val="nil"/>
               <w:left w:val="nil"/>
@@ -590,7 +473,7 @@
         </w:tc>
         <w:tc>
           <w:tcPr>
-            <w:tcW w:type="dxa" w:w="1247"/>
+            <w:tcW w:type="dxa" w:w="1361"/>
             <w:tcBorders>
               <w:top w:val="nil"/>
               <w:left w:val="nil"/>
@@ -612,9 +495,11 @@
             </w:r>
           </w:p>
         </w:tc>
+      </w:tr>
+      <w:tr>
         <w:tc>
           <w:tcPr>
-            <w:tcW w:type="dxa" w:w="2381"/>
+            <w:tcW w:type="dxa" w:w="1361"/>
             <w:tcBorders>
               <w:top w:val="nil"/>
               <w:left w:val="nil"/>
@@ -632,39 +517,13 @@
                 <w:color w:val="1B2A41"/>
                 <w:sz w:val="20"/>
               </w:rPr>
-              <w:t>María Daniela</w:t>
-            </w:r>
-          </w:p>
-        </w:tc>
-      </w:tr>
-      <w:tr>
-        <w:tc>
-          <w:tcPr>
-            <w:tcW w:type="dxa" w:w="1134"/>
-            <w:tcBorders>
-              <w:top w:val="nil"/>
-              <w:left w:val="nil"/>
-              <w:right w:val="nil"/>
-              <w:bottom w:val="single" w:sz="4" w:color="D8D4CC"/>
-            </w:tcBorders>
-          </w:tcPr>
-          <w:p>
-            <w:pPr>
-              <w:spacing w:after="0"/>
-            </w:pPr>
-            <w:r>
-              <w:rPr>
-                <w:rFonts w:ascii="Calibri" w:hAnsi="Calibri"/>
-                <w:color w:val="1B2A41"/>
-                <w:sz w:val="20"/>
-              </w:rPr>
-              <w:t>12:38</w:t>
+              <w:t>12:39</w:t>
             </w:r>
           </w:p>
         </w:tc>
         <w:tc>
           <w:tcPr>
-            <w:tcW w:type="dxa" w:w="3742"/>
+            <w:tcW w:type="dxa" w:w="4876"/>
             <w:tcBorders>
               <w:top w:val="nil"/>
               <w:left w:val="nil"/>
@@ -688,7 +547,7 @@
         </w:tc>
         <w:tc>
           <w:tcPr>
-            <w:tcW w:type="dxa" w:w="1247"/>
+            <w:tcW w:type="dxa" w:w="1361"/>
             <w:tcBorders>
               <w:top w:val="nil"/>
               <w:left w:val="nil"/>
@@ -706,31 +565,7 @@
                 <w:color w:val="1B2A41"/>
                 <w:sz w:val="20"/>
               </w:rPr>
-              <w:t>2:15</w:t>
-            </w:r>
-          </w:p>
-        </w:tc>
-        <w:tc>
-          <w:tcPr>
-            <w:tcW w:type="dxa" w:w="2381"/>
-            <w:tcBorders>
-              <w:top w:val="nil"/>
-              <w:left w:val="nil"/>
-              <w:right w:val="nil"/>
-              <w:bottom w:val="single" w:sz="4" w:color="D8D4CC"/>
-            </w:tcBorders>
-          </w:tcPr>
-          <w:p>
-            <w:pPr>
-              <w:spacing w:after="0"/>
-            </w:pPr>
-            <w:r>
-              <w:rPr>
-                <w:rFonts w:ascii="Calibri" w:hAnsi="Calibri"/>
-                <w:color w:val="1B2A41"/>
-                <w:sz w:val="20"/>
-              </w:rPr>
-              <w:t>María Daniela</w:t>
+              <w:t>2:13</w:t>
             </w:r>
           </w:p>
         </w:tc>
@@ -738,7 +573,7 @@
       <w:tr>
         <w:tc>
           <w:tcPr>
-            <w:tcW w:type="dxa" w:w="1134"/>
+            <w:tcW w:type="dxa" w:w="1361"/>
             <w:tcBorders>
               <w:top w:val="nil"/>
               <w:left w:val="nil"/>
@@ -757,13 +592,13 @@
                 <w:color w:val="A8532B"/>
                 <w:sz w:val="20"/>
               </w:rPr>
-              <w:t>14:54</w:t>
+              <w:t>14:53</w:t>
             </w:r>
           </w:p>
         </w:tc>
         <w:tc>
           <w:tcPr>
-            <w:tcW w:type="dxa" w:w="3742"/>
+            <w:tcW w:type="dxa" w:w="4876"/>
             <w:tcBorders>
               <w:top w:val="nil"/>
               <w:left w:val="nil"/>
@@ -788,7 +623,7 @@
         </w:tc>
         <w:tc>
           <w:tcPr>
-            <w:tcW w:type="dxa" w:w="1247"/>
+            <w:tcW w:type="dxa" w:w="1361"/>
             <w:tcBorders>
               <w:top w:val="nil"/>
               <w:left w:val="nil"/>
@@ -803,30 +638,8 @@
             <w:r>
               <w:rPr>
                 <w:rFonts w:ascii="Calibri" w:hAnsi="Calibri"/>
-                <w:color w:val="1B2A41"/>
-                <w:sz w:val="20"/>
-              </w:rPr>
-            </w:r>
-          </w:p>
-        </w:tc>
-        <w:tc>
-          <w:tcPr>
-            <w:tcW w:type="dxa" w:w="2381"/>
-            <w:tcBorders>
-              <w:top w:val="nil"/>
-              <w:left w:val="nil"/>
-              <w:right w:val="nil"/>
-              <w:bottom w:val="single" w:sz="4" w:color="D8D4CC"/>
-            </w:tcBorders>
-          </w:tcPr>
-          <w:p>
-            <w:pPr>
-              <w:spacing w:after="0"/>
-            </w:pPr>
-            <w:r>
-              <w:rPr>
-                <w:rFonts w:ascii="Calibri" w:hAnsi="Calibri"/>
-                <w:color w:val="1B2A41"/>
+                <w:b w:val="0"/>
+                <w:color w:val="A8532B"/>
                 <w:sz w:val="20"/>
               </w:rPr>
             </w:r>
@@ -901,7 +714,7 @@
           <w:color w:val="A8532B"/>
           <w:sz w:val="19"/>
         </w:rPr>
-        <w:t>0:00 – 1:01   ·   FREDY</w:t>
+        <w:t>0:00 – 1:04</w:t>
       </w:r>
     </w:p>
     <w:p>
@@ -938,40 +751,7 @@
           <w:color w:val="1B2A41"/>
           <w:sz w:val="25"/>
         </w:rPr>
-        <w:t>Buenas tardes. Somos el Grupo 1.</w:t>
-      </w:r>
-    </w:p>
-    <w:p>
-      <w:r>
-        <w:rPr>
-          <w:rFonts w:ascii="Calibri" w:hAnsi="Calibri"/>
-          <w:b w:val="0"/>
-          <w:color w:val="1B2A41"/>
-          <w:sz w:val="25"/>
-        </w:rPr>
-        <w:t>Voy a empezar con una pregunta. ¿Cuántos de ustedes han almorzado en un local de una cadena conocida? Casi todos. Ahora, ¿de quién era ese local?</w:t>
-      </w:r>
-    </w:p>
-    <w:p>
-      <w:r>
-        <w:rPr>
-          <w:rFonts w:ascii="Calibri" w:hAnsi="Calibri"/>
-          <w:b w:val="0"/>
-          <w:color w:val="1B2A41"/>
-          <w:sz w:val="25"/>
-        </w:rPr>
-        <w:t>Lo normal es pensar que es de la empresa dueña de la marca. Y casi nunca lo es. Es de un particular, alguien de la ciudad, que pagó para poder usar ese nombre y que firmó un contrato aceptando operar exactamente como la marca le diga.</w:t>
-      </w:r>
-    </w:p>
-    <w:p>
-      <w:r>
-        <w:rPr>
-          <w:rFonts w:ascii="Calibri" w:hAnsi="Calibri"/>
-          <w:b w:val="0"/>
-          <w:color w:val="1B2A41"/>
-          <w:sz w:val="25"/>
-        </w:rPr>
-        <w:t xml:space="preserve">De eso vamos a hablar hoy: del </w:t>
+        <w:t xml:space="preserve">Buenas tardes. Voy a presentarles el trabajo del Grupo 1 sobre el </w:t>
       </w:r>
       <w:r>
         <w:rPr>
@@ -989,7 +769,7 @@
           <w:color w:val="1B2A41"/>
           <w:sz w:val="25"/>
         </w:rPr>
-        <w:t>. Es uno de los acuerdos comerciales más extendidos del mundo, está en la esquina de su casa, y aun así casi nadie sabe qué dice por dentro.</w:t>
+        <w:t>.</w:t>
       </w:r>
     </w:p>
     <w:p>
@@ -1000,7 +780,29 @@
           <w:color w:val="1B2A41"/>
           <w:sz w:val="25"/>
         </w:rPr>
-        <w:t>En los próximos quince minutos van a saber qué se compra exactamente cuando alguien compra una franquicia, cuánto le cuesta, y qué es lo que entrega en el camino.</w:t>
+        <w:t>Empiezo por algo que suele pasar desapercibido. Cuando entramos a un local de una cadena conocida, una cafetería, una tienda de ropa, un restaurante de comida rápida, lo natural es asumir que ese local es de la empresa dueña de la marca. Casi nunca lo es. Suele ser de un particular, alguien de la ciudad, que pagó para poder usar ese nombre y que firmó un contrato aceptando operar exactamente como la marca le indique.</w:t>
+      </w:r>
+    </w:p>
+    <w:p>
+      <w:r>
+        <w:rPr>
+          <w:rFonts w:ascii="Calibri" w:hAnsi="Calibri"/>
+          <w:b w:val="0"/>
+          <w:color w:val="1B2A41"/>
+          <w:sz w:val="25"/>
+        </w:rPr>
+        <w:t>Ese contrato es del que voy a hablar. Es uno de los acuerdos comerciales más extendidos del mundo, está en la esquina de nuestra casa, y aun así casi nadie sabe qué dice por dentro.</w:t>
+      </w:r>
+    </w:p>
+    <w:p>
+      <w:r>
+        <w:rPr>
+          <w:rFonts w:ascii="Calibri" w:hAnsi="Calibri"/>
+          <w:b w:val="0"/>
+          <w:color w:val="1B2A41"/>
+          <w:sz w:val="25"/>
+        </w:rPr>
+        <w:t>En los próximos quince minutos van a saber qué se compra exactamente cuando alguien compra una franquicia, cuánto le cuesta y qué entrega en el camino.</w:t>
       </w:r>
     </w:p>
     <w:p>
@@ -1018,7 +820,7 @@
           <w:color w:val="A8532B"/>
           <w:sz w:val="19"/>
         </w:rPr>
-        <w:t>1:01 – 4:31   ·   FREDY</w:t>
+        <w:t>1:04 – 4:34</w:t>
       </w:r>
     </w:p>
     <w:p>
@@ -1273,7 +1075,7 @@
           <w:color w:val="A8532B"/>
           <w:sz w:val="19"/>
         </w:rPr>
-        <w:t>4:31 – 7:18   ·   MARÍA ISABEL</w:t>
+        <w:t>4:34 – 7:20</w:t>
       </w:r>
     </w:p>
     <w:p>
@@ -1376,7 +1178,7 @@
           <w:color w:val="1B2A41"/>
           <w:sz w:val="25"/>
         </w:rPr>
-        <w:t xml:space="preserve">Y hay una regla previa a todo esto que a nosotros nos pareció lo más interesante de la figura. Antes de firmar, la marca está obligada a entregarle a quien va a invertir información real del negocio: quién es, cómo está el sector, cómo funciona la red. Y con </w:t>
+        <w:t xml:space="preserve">Y hay una regla previa a todo esto que me parece lo más interesante de la figura. Antes de firmar, la marca está obligada a entregarle a quien va a invertir información real del negocio: quién es, cómo está el sector, cómo funciona la red. Y con </w:t>
       </w:r>
       <w:r>
         <w:rPr>
@@ -1430,7 +1232,7 @@
           <w:color w:val="A8532B"/>
           <w:sz w:val="19"/>
         </w:rPr>
-        <w:t>7:18 – 10:34   ·   XILENA</w:t>
+        <w:t>7:20 – 10:35</w:t>
       </w:r>
     </w:p>
     <w:p>
@@ -1652,7 +1454,7 @@
           <w:color w:val="1B2A41"/>
           <w:sz w:val="25"/>
         </w:rPr>
-        <w:t>Eso lleva a una pregunta que en la práctica se pelea mucho: si un cliente sufre un daño dentro del local, ¿a quién demanda? Por regla general responde el franquiciado, incluso por lo que hagan sus empleados, justamente porque es independiente. El letrero de la marca en la puerta no basta para responsabilizar a la marca. Pero los tribunales españoles han hecho una excepción, sobre todo en clínicas estéticas y odontológicas: cuando se prueba que el daño vino de una instrucción concreta que impuso la marca, la marca responde. Tener manuales y supervisar no alcanza; hay que probar que la orden causó el daño.</w:t>
+        <w:t>Eso lleva al punto que más se pelea en la práctica: quién responde cuando un cliente sufre un daño dentro del local. Por regla general responde el franquiciado, incluso por lo que hagan sus empleados, justamente porque es independiente. El letrero de la marca en la puerta no basta para responsabilizar a la marca. Pero los tribunales españoles han hecho una excepción, sobre todo en clínicas estéticas y odontológicas: cuando se prueba que el daño vino de una instrucción concreta que impuso la marca, la marca responde. Tener manuales y supervisar no alcanza; hay que probar que la orden causó el daño.</w:t>
       </w:r>
     </w:p>
     <w:p>
@@ -1681,7 +1483,7 @@
           <w:color w:val="A8532B"/>
           <w:sz w:val="19"/>
         </w:rPr>
-        <w:t>10:34 – 12:38   ·   MARÍA DANIELA</w:t>
+        <w:t>10:35 – 12:39</w:t>
       </w:r>
     </w:p>
     <w:p>
@@ -1798,7 +1600,7 @@
           <w:color w:val="A8532B"/>
           <w:sz w:val="19"/>
         </w:rPr>
-        <w:t>12:38 – 14:54   ·   MARÍA DANIELA</w:t>
+        <w:t>12:39 – 14:53</w:t>
       </w:r>
     </w:p>
     <w:p>
@@ -1835,7 +1637,7 @@
           <w:color w:val="1B2A41"/>
           <w:sz w:val="25"/>
         </w:rPr>
-        <w:t>Para cerrar, tres cosas que nos quedaron claras.</w:t>
+        <w:t>Para cerrar, tres conclusiones.</w:t>
       </w:r>
     </w:p>
     <w:p>
@@ -1875,7 +1677,7 @@
           <w:color w:val="1B2A41"/>
           <w:sz w:val="25"/>
         </w:rPr>
-        <w:t xml:space="preserve"> y es la que más nos sorprendió: qué tan expuestas están las partes depende del país. Donde la ley regula la figura hay un piso mínimo de protección. Donde no, como en Colombia o en Perú, ese piso lo pone el contrato o no lo pone nadie. Un contrato mal redactado ahí no es un problema de forma: es quedarse sin defensa.</w:t>
+        <w:t xml:space="preserve"> y es la que más me sorprendió: qué tan expuestas están las partes depende del país. Donde la ley regula la figura hay un piso mínimo de protección. Donde no, como en Colombia o en Perú, ese piso lo pone el contrato o no lo pone nadie. Un contrato mal redactado ahí no es un problema de forma: es quedarse sin defensa.</w:t>
       </w:r>
     </w:p>
     <w:p>
@@ -1993,7 +1795,7 @@
           <w:color w:val="1B2A41"/>
           <w:sz w:val="25"/>
         </w:rPr>
-        <w:t>Con esto cerramos. Gracias.</w:t>
+        <w:t>Con esto cierro. Gracias.</w:t>
       </w:r>
     </w:p>
     <w:p>
@@ -2048,7 +1850,7 @@
           <w:color w:val="1B2A41"/>
           <w:sz w:val="25"/>
         </w:rPr>
-        <w:t>Como vieron, lo que sostiene una franquicia no es el texto del contrato, sino la disciplina con que se repite el estándar y la maña con que se adapta a cada mercado. Quedamos atentos a sus preguntas.</w:t>
+        <w:t>Como vieron, lo que sostiene una franquicia no es el texto del contrato, sino la disciplina con que se repite el estándar y la maña con que se adapta a cada mercado. Con gusto respondo sus preguntas.</w:t>
       </w:r>
     </w:p>
     <w:p>

</xml_diff>

<commit_message>
Elevar el registro del guion y rehacer la apertura
El auditorio tiene experiencia profesional, así que el guion pasa a un
registro acorde: se eliminan los coloquialismos (plata, maña, poner el
cuerpo, paga la cuenta, si se pierden) y el tono didáctico que trataba al
público como si no supiera de negocios.

La apertura ya no parte de la observación ingenua de que el local de una
cadena no es de la marca. Ahora plantea la restricción de capital que
enfrenta cualquier empresa al expandirse, presenta la franquicia como una
tercera vía frente a endeudarse o crecer despacio, y señala su costo:
entregar a un tercero el nombre y el método.

Los términos técnicos siguen definidos, pero con precisión en lugar de
paráfrasis escolar. Se recuperan dos nociones que se habían perdido: la
condición de contrato marco y la prohibición de competencia.
</commit_message>
<xml_diff>
--- a/Guion exposicion - Contrato de franquicia.docx
+++ b/Guion exposicion - Contrato de franquicia.docx
@@ -50,7 +50,7 @@
           <w:color w:val="707886"/>
           <w:sz w:val="22"/>
         </w:rPr>
-        <w:t>El video de la entrevista va después de los quince minutos, así que estos quince son de exposición hablada. La diapositiva 6 cierra la exposición y deja el video montado. Leído a ritmo normal, unas 140 palabras por minuto, el guion completo da 14:53.</w:t>
+        <w:t>El video de la entrevista se proyecta después de los quince minutos, de modo que estos quince corresponden íntegramente a la exposición. La diapositiva 6 la cierra y deja el video montado. Leído a ritmo normal, unas 140 palabras por minuto, el guion completo da 14:59.</w:t>
       </w:r>
     </w:p>
     <w:tbl>
@@ -195,7 +195,7 @@
                 <w:color w:val="1B2A41"/>
                 <w:sz w:val="20"/>
               </w:rPr>
-              <w:t>1:04</w:t>
+              <w:t>1:08</w:t>
             </w:r>
           </w:p>
         </w:tc>
@@ -221,7 +221,7 @@
                 <w:color w:val="1B2A41"/>
                 <w:sz w:val="20"/>
               </w:rPr>
-              <w:t>1:04</w:t>
+              <w:t>1:08</w:t>
             </w:r>
           </w:p>
         </w:tc>
@@ -269,7 +269,7 @@
                 <w:color w:val="1B2A41"/>
                 <w:sz w:val="20"/>
               </w:rPr>
-              <w:t>3:30</w:t>
+              <w:t>3:32</w:t>
             </w:r>
           </w:p>
         </w:tc>
@@ -295,7 +295,7 @@
                 <w:color w:val="1B2A41"/>
                 <w:sz w:val="20"/>
               </w:rPr>
-              <w:t>4:34</w:t>
+              <w:t>4:40</w:t>
             </w:r>
           </w:p>
         </w:tc>
@@ -343,7 +343,7 @@
                 <w:color w:val="1B2A41"/>
                 <w:sz w:val="20"/>
               </w:rPr>
-              <w:t>2:45</w:t>
+              <w:t>2:37</w:t>
             </w:r>
           </w:p>
         </w:tc>
@@ -369,7 +369,7 @@
                 <w:color w:val="1B2A41"/>
                 <w:sz w:val="20"/>
               </w:rPr>
-              <w:t>7:20</w:t>
+              <w:t>7:17</w:t>
             </w:r>
           </w:p>
         </w:tc>
@@ -417,7 +417,7 @@
                 <w:color w:val="1B2A41"/>
                 <w:sz w:val="20"/>
               </w:rPr>
-              <w:t>3:15</w:t>
+              <w:t>3:17</w:t>
             </w:r>
           </w:p>
         </w:tc>
@@ -491,7 +491,7 @@
                 <w:color w:val="1B2A41"/>
                 <w:sz w:val="20"/>
               </w:rPr>
-              <w:t>2:04</w:t>
+              <w:t>2:02</w:t>
             </w:r>
           </w:p>
         </w:tc>
@@ -517,7 +517,7 @@
                 <w:color w:val="1B2A41"/>
                 <w:sz w:val="20"/>
               </w:rPr>
-              <w:t>12:39</w:t>
+              <w:t>12:37</w:t>
             </w:r>
           </w:p>
         </w:tc>
@@ -565,7 +565,7 @@
                 <w:color w:val="1B2A41"/>
                 <w:sz w:val="20"/>
               </w:rPr>
-              <w:t>2:13</w:t>
+              <w:t>2:21</w:t>
             </w:r>
           </w:p>
         </w:tc>
@@ -592,7 +592,7 @@
                 <w:color w:val="A8532B"/>
                 <w:sz w:val="20"/>
               </w:rPr>
-              <w:t>14:53</w:t>
+              <w:t>14:59</w:t>
             </w:r>
           </w:p>
         </w:tc>
@@ -670,7 +670,7 @@
           <w:color w:val="707886"/>
           <w:sz w:val="21"/>
         </w:rPr>
-        <w:t>Para ganar unos 45 segundos: en la diapositiva 4, omitir el párrafo de a quién demanda el cliente.</w:t>
+        <w:t>Para recuperar unos 50 segundos: en la diapositiva 4, omitir el párrafo sobre responsabilidad frente al consumidor.</w:t>
       </w:r>
     </w:p>
     <w:p>
@@ -683,7 +683,7 @@
           <w:color w:val="707886"/>
           <w:sz w:val="21"/>
         </w:rPr>
-        <w:t>Para ganar unos 20 segundos: en la diapositiva 5, saltarse el ejemplo de la marca en las noticias.</w:t>
+        <w:t>Para recuperar unos 20 segundos: en la diapositiva 5, suprimir el caso del deterioro reputacional.</w:t>
       </w:r>
     </w:p>
     <w:p>
@@ -696,7 +696,7 @@
           <w:color w:val="707886"/>
           <w:sz w:val="21"/>
         </w:rPr>
-        <w:t>Si sobra tiempo: en la 5, desarrollar más los ejemplos. Es lo que el público agradece.</w:t>
+        <w:t>Si sobra tiempo: desarrollar los ejemplos de la diapositiva 5, que es donde la explicación gana concreción.</w:t>
       </w:r>
     </w:p>
     <w:p>
@@ -714,7 +714,7 @@
           <w:color w:val="A8532B"/>
           <w:sz w:val="19"/>
         </w:rPr>
-        <w:t>0:00 – 1:04</w:t>
+        <w:t>0:00 – 1:08</w:t>
       </w:r>
     </w:p>
     <w:p>
@@ -780,7 +780,7 @@
           <w:color w:val="1B2A41"/>
           <w:sz w:val="25"/>
         </w:rPr>
-        <w:t>Empiezo por algo que suele pasar desapercibido. Cuando entramos a un local de una cadena conocida, una cafetería, una tienda de ropa, un restaurante de comida rápida, lo natural es asumir que ese local es de la empresa dueña de la marca. Casi nunca lo es. Suele ser de un particular, alguien de la ciudad, que pagó para poder usar ese nombre y que firmó un contrato aceptando operar exactamente como la marca le indique.</w:t>
+        <w:t>Toda empresa que decide crecer enfrenta la misma restricción: la expansión exige capital, y el capital propio siempre es limitado. Las respuestas habituales son endeudarse o abrir más despacio. La franquicia plantea una tercera: expandirse con capital de terceros, cediéndoles el derecho a operar bajo la marca.</w:t>
       </w:r>
     </w:p>
     <w:p>
@@ -791,7 +791,7 @@
           <w:color w:val="1B2A41"/>
           <w:sz w:val="25"/>
         </w:rPr>
-        <w:t>Ese contrato es del que voy a hablar. Es uno de los acuerdos comerciales más extendidos del mundo, está en la esquina de nuestra casa, y aun así casi nadie sabe qué dice por dentro.</w:t>
+        <w:t>El costo de esa decisión es alto. Obliga a entregarle a un tercero lo único que sostiene el valor de la empresa —su nombre y su forma de trabajar— y a confiar en que lo ejecutará con el mismo estándar, en un mercado donde el titular no está presente.</w:t>
       </w:r>
     </w:p>
     <w:p>
@@ -802,7 +802,7 @@
           <w:color w:val="1B2A41"/>
           <w:sz w:val="25"/>
         </w:rPr>
-        <w:t>En los próximos quince minutos van a saber qué se compra exactamente cuando alguien compra una franquicia, cuánto le cuesta y qué entrega en el camino.</w:t>
+        <w:t>El contrato de franquicia es el instrumento que vuelve administrable esa decisión. Define qué se transfiere, qué se cobra, qué se controla y qué ocurre cuando la relación se rompe. En los próximos quince minutos voy a recorrer cómo está construido, quiénes intervienen y qué asume cada parte.</w:t>
       </w:r>
     </w:p>
     <w:p>
@@ -820,7 +820,7 @@
           <w:color w:val="A8532B"/>
           <w:sz w:val="19"/>
         </w:rPr>
-        <w:t>1:04 – 4:34</w:t>
+        <w:t>1:08 – 4:40</w:t>
       </w:r>
     </w:p>
     <w:p>
@@ -857,7 +857,7 @@
           <w:color w:val="1B2A41"/>
           <w:sz w:val="25"/>
         </w:rPr>
-        <w:t>Cuando una empresa franquicia, lo que vende no es un producto. Vende la posibilidad de repetir su negocio.</w:t>
+        <w:t>Franquiciar no consiste en vender un producto, sino en transferir la capacidad de reproducir un negocio. Esa capacidad se compone de tres elementos, con naturaleza y valor distintos.</w:t>
       </w:r>
     </w:p>
     <w:p>
@@ -868,7 +868,7 @@
           <w:color w:val="1B2A41"/>
           <w:sz w:val="25"/>
         </w:rPr>
-        <w:t>Y eso se reparte en tres cosas muy distintas.</w:t>
+        <w:t>El primero es la marca. Su función económica es concreta: le ahorra al nuevo establecimiento los años que toma construir reputación en un mercado. El cliente ingresa con una expectativa ya formada.</w:t>
       </w:r>
     </w:p>
     <w:p>
@@ -879,18 +879,7 @@
           <w:color w:val="1B2A41"/>
           <w:sz w:val="25"/>
         </w:rPr>
-        <w:t>La primera es la más visible: el letrero. Una marca que la gente ya reconoce le ahorra al negocio los tres o cuatro años que toma ganarse la confianza de un barrio. El cliente entra porque ya sabe qué va a encontrar.</w:t>
-      </w:r>
-    </w:p>
-    <w:p>
-      <w:r>
-        <w:rPr>
-          <w:rFonts w:ascii="Calibri" w:hAnsi="Calibri"/>
-          <w:b w:val="0"/>
-          <w:color w:val="1B2A41"/>
-          <w:sz w:val="25"/>
-        </w:rPr>
-        <w:t xml:space="preserve">La segunda es el </w:t>
+        <w:t xml:space="preserve">El segundo es el </w:t>
       </w:r>
       <w:r>
         <w:rPr>
@@ -908,7 +897,7 @@
           <w:color w:val="1B2A41"/>
           <w:sz w:val="25"/>
         </w:rPr>
-        <w:t>, y aquí me quiero detener, porque es la que menos se entiende. Know-how viene del inglés y significa saber hacer. Piensen en un restaurante que lleva veinte años abierto. En esos veinte años aprendió a qué temperatura sale mejor cada plato, cuánta gente necesita un sábado, en qué orden armar los pedidos para que no se enfríen, qué hacer cuando un cliente reclama. Nada de eso está patentado, porque no es un invento: es experiencia, y se aprendió perdiendo dinero. Cuando la empresa franquicia, le entrega todo eso escrito, en manuales, a alguien que acaba de conocer. Por eso el contrato lo blinda: el franquiciado lo puede usar, pero no lo puede contar, ni durante ni después.</w:t>
+        <w:t>, y es donde reside el valor real del sistema. Se traduce como saber hacer, y comprende el conjunto de procedimientos que la empresa depuró a lo largo de años de operación: estándares de producción, dimensionamiento del personal, protocolos de atención, manejo de reclamos, control de inventarios. No es materia patentable, porque no se trata de una invención sino de experiencia acumulada, buena parte de ella a costa de errores costosos. Al franquiciar, todo eso se documenta en manuales y se entrega a un tercero. De ahí la severidad de las cláusulas de confidencialidad: el franquiciado queda autorizado a utilizarlo, no a divulgarlo, y esa obligación sobrevive a la terminación del contrato.</w:t>
       </w:r>
     </w:p>
     <w:p>
@@ -919,7 +908,7 @@
           <w:color w:val="1B2A41"/>
           <w:sz w:val="25"/>
         </w:rPr>
-        <w:t>La tercera es la forma de operar: cómo se ve el local, cómo se atiende, cómo se hace la publicidad. Y esto no es capricho estético. Es lo que permite que ustedes entren a un local en Bogotá y a otro en Quito, con dueños que no se conocen entre sí, y no noten la diferencia.</w:t>
+        <w:t>El tercero es el sistema de operación: configuración del local, protocolo de servicio, política publicitaria. No responde a un criterio estético, sino a la necesidad de que dos establecimientos con propietarios distintos resulten indistinguibles para el consumidor.</w:t>
       </w:r>
     </w:p>
     <w:p>
@@ -930,7 +919,7 @@
           <w:color w:val="1B2A41"/>
           <w:sz w:val="25"/>
         </w:rPr>
-        <w:t>Eso, todo junto, es una franquicia.</w:t>
+        <w:t>Esos tres elementos, en conjunto, constituyen la franquicia.</w:t>
       </w:r>
     </w:p>
     <w:p>
@@ -941,7 +930,7 @@
           <w:color w:val="1B2A41"/>
           <w:sz w:val="25"/>
         </w:rPr>
-        <w:t>Ahora, una cosa es el negocio y otra es el papel. El contrato es donde queda escrito cuánto se paga, por cuánto tiempo, en qué zona, qué puede hacer cada uno y qué pasa si alguien incumple.</w:t>
+        <w:t>El contrato opera en otro plano. Es el instrumento donde se fijan la contraprestación, el plazo, el territorio, las facultades de cada parte y las consecuencias del incumplimiento. Presenta dos particularidades que lo separan de la contratación mercantil ordinaria.</w:t>
       </w:r>
     </w:p>
     <w:p>
@@ -952,7 +941,7 @@
           <w:color w:val="1B2A41"/>
           <w:sz w:val="25"/>
         </w:rPr>
-        <w:t>Y tiene dos cosas que suelen sorprender.</w:t>
+        <w:t>La primera: no se agota en un acto. En una compraventa hay una prestación, una contraprestación y la relación se extingue. Aquí la relación permanece activa durante toda la vigencia, con pagos periódicos, asistencia continua y supervisión permanente. Su estructura se aproxima más al arrendamiento que a la compraventa.</w:t>
       </w:r>
     </w:p>
     <w:p>
@@ -963,7 +952,25 @@
           <w:color w:val="1B2A41"/>
           <w:sz w:val="25"/>
         </w:rPr>
-        <w:t>La primera: no se parece a una compraventa. Cuando yo les compro algo, les doy plata, me dan la cosa y la relación se acaba. Aquí no se acaba: se sigue pagando cada mes, se sigue recibiendo asistencia, se sigue siendo supervisado. Se parece mucho más a un arriendo que a una compra.</w:t>
+        <w:t xml:space="preserve">La segunda es menos evidente: el contrato es </w:t>
+      </w:r>
+      <w:r>
+        <w:rPr>
+          <w:rFonts w:ascii="Calibri" w:hAnsi="Calibri"/>
+          <w:b/>
+          <w:color w:val="1B2A41"/>
+          <w:sz w:val="25"/>
+        </w:rPr>
+        <w:t>deliberadamente incompleto</w:t>
+      </w:r>
+      <w:r>
+        <w:rPr>
+          <w:rFonts w:ascii="Calibri" w:hAnsi="Calibri"/>
+          <w:b w:val="0"/>
+          <w:color w:val="1B2A41"/>
+          <w:sz w:val="25"/>
+        </w:rPr>
+        <w:t>. Ninguno anticipa un cambio en los hábitos de consumo a ocho años, ni una contingencia sanitaria. Y no se trata de una deficiencia de redacción. Un contrato que cerrara todas las variables impediría a la red ajustarse cuando el mercado se desplaza. Ese margen es lo que le da capacidad de adaptación.</w:t>
       </w:r>
     </w:p>
     <w:p>
@@ -974,7 +981,7 @@
           <w:color w:val="1B2A41"/>
           <w:sz w:val="25"/>
         </w:rPr>
-        <w:t xml:space="preserve">La segunda: está </w:t>
+        <w:t xml:space="preserve">A ello se suma su condición de </w:t>
       </w:r>
       <w:r>
         <w:rPr>
@@ -983,7 +990,7 @@
           <w:color w:val="1B2A41"/>
           <w:sz w:val="25"/>
         </w:rPr>
-        <w:t>incompleto a propósito</w:t>
+        <w:t>contrato marco</w:t>
       </w:r>
       <w:r>
         <w:rPr>
@@ -992,7 +999,7 @@
           <w:color w:val="1B2A41"/>
           <w:sz w:val="25"/>
         </w:rPr>
-        <w:t>. Ningún contrato de franquicia dice qué hacer si en ocho años cambia la forma en que la gente compra, o si aparece una pandemia. Y no es descuido del abogado. Si el contrato amarrara todo, la red no podría moverse cuando el mercado se mueve. Ese margen es lo que la mantiene viva.</w:t>
+        <w:t>: no regula una operación aislada, sino la incorporación a una red. Por eso las obligaciones del franquiciado no derivan únicamente del texto pactado, sino también de la ejecución cotidiana del know-how dentro de ese sistema.</w:t>
       </w:r>
     </w:p>
     <w:p>
@@ -1003,7 +1010,7 @@
           <w:color w:val="1B2A41"/>
           <w:sz w:val="25"/>
         </w:rPr>
-        <w:t xml:space="preserve">Y una advertencia que cambia según dónde estén parados. En </w:t>
+        <w:t xml:space="preserve">Por último, el grado de protección varía según la jurisdicción. </w:t>
       </w:r>
       <w:r>
         <w:rPr>
@@ -1021,7 +1028,7 @@
           <w:color w:val="1B2A41"/>
           <w:sz w:val="25"/>
         </w:rPr>
-        <w:t xml:space="preserve">, si mañana hay un pleito por una franquicia, hay artículos concretos en el Código Civil y Comercial a los que acudir. En </w:t>
+        <w:t xml:space="preserve"> tipificó la figura en su Código Civil y Comercial: ante un litigio existen artículos aplicables. </w:t>
       </w:r>
       <w:r>
         <w:rPr>
@@ -1039,7 +1046,7 @@
           <w:color w:val="1B2A41"/>
           <w:sz w:val="25"/>
         </w:rPr>
-        <w:t xml:space="preserve"> el Código de Comercio también la reconoce. En </w:t>
+        <w:t xml:space="preserve"> la reconoce en su Código de Comercio. </w:t>
       </w:r>
       <w:r>
         <w:rPr>
@@ -1057,7 +1064,7 @@
           <w:color w:val="1B2A41"/>
           <w:sz w:val="25"/>
         </w:rPr>
-        <w:t>, no: la ley no menciona esta figura. No es ilegal, pero significa que si el contrato no dice algo, probablemente nadie lo dice. Ahí el contrato no es un respaldo del acuerdo: es todo el acuerdo.</w:t>
+        <w:t xml:space="preserve"> la mantienen como contrato atípico, es decir, la ley no la nombra. No es una figura ilegal, pero implica que lo que el contrato no prevea, no lo prevé nadie. En esas jurisdicciones el contrato no respalda el acuerdo: lo constituye por completo.</w:t>
       </w:r>
     </w:p>
     <w:p>
@@ -1075,7 +1082,7 @@
           <w:color w:val="A8532B"/>
           <w:sz w:val="19"/>
         </w:rPr>
-        <w:t>4:34 – 7:20</w:t>
+        <w:t>4:40 – 7:17</w:t>
       </w:r>
     </w:p>
     <w:p>
@@ -1112,7 +1119,7 @@
           <w:color w:val="1B2A41"/>
           <w:sz w:val="25"/>
         </w:rPr>
-        <w:t>Veamos cómo pasa esto en la vida real.</w:t>
+        <w:t>El ciclo tiene cinco etapas, y la primera no es la firma: es la selección.</w:t>
       </w:r>
     </w:p>
     <w:p>
@@ -1123,7 +1130,7 @@
           <w:color w:val="1B2A41"/>
           <w:sz w:val="25"/>
         </w:rPr>
-        <w:t>No arranca con una firma; arranca con una entrevista. La marca escoge, y escoge con desconfianza, porque cada local que se abre lleva su nombre en la fachada. Tener el dinero no alcanza. Hay estudios que muestran que escoger bien al franquiciado es una de las decisiones que más determina si toda la red funciona. Y la lógica es dura: si el franquiciado lo hace mal, él pierde su inversión, pero la marca pierde reputación en toda la ciudad.</w:t>
+        <w:t>El titular de la marca evalúa candidatos con criterio restrictivo, porque cada establecimiento que abre compromete su nombre. La capacidad de inversión no es suficiente. La literatura especializada identifica la selección de franquiciados como una de las decisiones determinantes del desempeño del sistema completo, y la razón es asimétrica: si el franquiciado opera mal, él pierde su inversión, pero la marca pierde posicionamiento en todo el mercado.</w:t>
       </w:r>
     </w:p>
     <w:p>
@@ -1134,7 +1141,7 @@
           <w:color w:val="1B2A41"/>
           <w:sz w:val="25"/>
         </w:rPr>
-        <w:t>Cuando hay acuerdo, se firma. Y en ese momento no solo se fija el precio: se fija cómo se sale. Cuánto dura, cómo se renueva, en qué casos se puede terminar antes y quién decide si hay pelea. Todo eso se define al principio, cuando las dos partes están contentas, precisamente porque después ya no se van a poner de acuerdo.</w:t>
+        <w:t>Alcanzado el acuerdo, se formaliza. Y en ese momento no solo se define el precio: se define la salida. Plazo, condiciones de renovación, causales de terminación anticipada y mecanismo de solución de controversias. Todo eso se pacta al inicio, cuando existe voluntad de acuerdo, precisamente porque después no la habrá.</w:t>
       </w:r>
     </w:p>
     <w:p>
@@ -1145,7 +1152,7 @@
           <w:color w:val="1B2A41"/>
           <w:sz w:val="25"/>
         </w:rPr>
-        <w:t>Después viene la parte que nadie ve: la capacitación. Semanas de entrenamiento para el dueño y para los empleados, manuales, acompañamiento en la apertura. Aquí es donde el know-how cambia de manos de verdad.</w:t>
+        <w:t>Sigue la transferencia y la capacitación, que es la etapa menos visible y una de las más determinantes: entrenamiento del propietario y del personal, entrega de manuales, acompañamiento en la apertura. Es aquí donde el know-how cambia de titular en términos prácticos.</w:t>
       </w:r>
     </w:p>
     <w:p>
@@ -1156,7 +1163,7 @@
           <w:color w:val="1B2A41"/>
           <w:sz w:val="25"/>
         </w:rPr>
-        <w:t>Abre el local. Y a partir de ahí el franquiciado hace casi todo: contrata, paga la nómina, atiende, responde por el arriendo. Pero lo hace dentro de reglas que no escribió él.</w:t>
+        <w:t>Luego opera el establecimiento. El franquiciado asume la gestión completa —contratación, nómina, atención, obligaciones locales— pero la ejerce dentro de parámetros que no definió.</w:t>
       </w:r>
     </w:p>
     <w:p>
@@ -1167,7 +1174,7 @@
           <w:color w:val="1B2A41"/>
           <w:sz w:val="25"/>
         </w:rPr>
-        <w:t>Y la marca no se va: vuelve. Visita el local, revisa que los estándares se cumplan, audita las instalaciones y en muchos contratos también los libros contables. Suena invasivo, y lo es, pero está aceptado desde el primer día. La razón es práctica: cuando un cliente tiene una mala experiencia, no dice «qué mal ese dueño». Dice «qué mal esa marca». El daño se reparte entre todos.</w:t>
+        <w:t>Y la relación no termina ahí: continúa la supervisión. Visitas, verificación de estándares, auditoría de instalaciones y, en muchos contratos, revisión de los libros contables. Es una facultad intrusiva, y está aceptada desde el inicio por una razón práctica: cuando el servicio falla, el consumidor no atribuye la falla al propietario del local, la atribuye a la marca. El costo reputacional se distribuye sobre toda la red.</w:t>
       </w:r>
     </w:p>
     <w:p>
@@ -1178,7 +1185,7 @@
           <w:color w:val="1B2A41"/>
           <w:sz w:val="25"/>
         </w:rPr>
-        <w:t xml:space="preserve">Y hay una regla previa a todo esto que me parece lo más interesante de la figura. Antes de firmar, la marca está obligada a entregarle a quien va a invertir información real del negocio: quién es, cómo está el sector, cómo funciona la red. Y con </w:t>
+        <w:t xml:space="preserve">Hay además una obligación previa a todo el ciclo, que a mi juicio es la que mejor caracteriza esta figura. Antes de la firma, el titular de la marca debe entregar al futuro franquiciado información veraz sobre el negocio: su identidad, la situación del sector, la estructura de la red. Y con </w:t>
       </w:r>
       <w:r>
         <w:rPr>
@@ -1196,7 +1203,7 @@
           <w:color w:val="1B2A41"/>
           <w:sz w:val="25"/>
         </w:rPr>
-        <w:t xml:space="preserve"> de anticipación, para que la persona lo lea con calma y no firme en caliente. Existe porque el desequilibrio es brutal: quien vende conoce el negocio a fondo, y quien compra está apostando a ciegas. Y si esa información se oculta o se maquilla, hay responsabilidad legal </w:t>
+        <w:t xml:space="preserve"> de anticipación, para que la decisión se adopte con información completa. El fundamento es la asimetría: quien ofrece conoce el negocio en detalle y quien invierte lo desconoce casi por completo. El incumplimiento de este deber genera responsabilidad por daños </w:t>
       </w:r>
       <w:r>
         <w:rPr>
@@ -1205,7 +1212,7 @@
           <w:color w:val="1B2A41"/>
           <w:sz w:val="25"/>
         </w:rPr>
-        <w:t>aunque el contrato nunca se llegue a firmar</w:t>
+        <w:t>aunque el contrato nunca llegue a celebrarse</w:t>
       </w:r>
       <w:r>
         <w:rPr>
@@ -1232,7 +1239,7 @@
           <w:color w:val="A8532B"/>
           <w:sz w:val="19"/>
         </w:rPr>
-        <w:t>7:20 – 10:35</w:t>
+        <w:t>7:17 – 10:35</w:t>
       </w:r>
     </w:p>
     <w:p>
@@ -1269,7 +1276,7 @@
           <w:color w:val="1B2A41"/>
           <w:sz w:val="25"/>
         </w:rPr>
-        <w:t xml:space="preserve">Aquí hay dos, y sus nombres se parecen tanto que se confunden. El </w:t>
+        <w:t xml:space="preserve">Intervienen dos partes, con denominaciones que se confunden con facilidad. El </w:t>
       </w:r>
       <w:r>
         <w:rPr>
@@ -1287,7 +1294,7 @@
           <w:color w:val="1B2A41"/>
           <w:sz w:val="25"/>
         </w:rPr>
-        <w:t xml:space="preserve"> es el dueño de la marca. El </w:t>
+        <w:t xml:space="preserve">, también llamado franquiciante u otorgante, es el titular de la marca. El </w:t>
       </w:r>
       <w:r>
         <w:rPr>
@@ -1305,7 +1312,7 @@
           <w:color w:val="1B2A41"/>
           <w:sz w:val="25"/>
         </w:rPr>
-        <w:t xml:space="preserve"> es quien abre el local. Si se pierden, piensen en el dueño de la receta y el dueño del local.</w:t>
+        <w:t>, o franquiciatario, es quien explota el establecimiento.</w:t>
       </w:r>
     </w:p>
     <w:p>
@@ -1316,7 +1323,7 @@
           <w:color w:val="1B2A41"/>
           <w:sz w:val="25"/>
         </w:rPr>
-        <w:t>El dueño de la marca pone lo que no se puede tocar: el nombre, el saber hacer, los manuales, la asistencia. Y antes de poder franquiciar tuvo que hacer funcionar su propio negocio durante años. Nadie franquicia una idea; se franquicia un historial. Ese historial es exactamente lo que está vendiendo.</w:t>
+        <w:t>El franquiciador aporta activos intangibles: el nombre comercial, el know-how, los manuales y la asistencia técnica. Y hay un requisito previo que suele omitirse: para franquiciar debió haber operado con éxito su propio negocio durante un período razonable. No se franquicia un proyecto; se franquicia un historial acreditado. Ese historial es lo que determina el valor de lo que ofrece.</w:t>
       </w:r>
     </w:p>
     <w:p>
@@ -1327,7 +1334,7 @@
           <w:color w:val="1B2A41"/>
           <w:sz w:val="25"/>
         </w:rPr>
-        <w:t xml:space="preserve">A cambio recibe plata por dos vías distintas, y no son lo mismo. Una es el </w:t>
+        <w:t xml:space="preserve">Su contraprestación llega por dos vías que no deben confundirse. El </w:t>
       </w:r>
       <w:r>
         <w:rPr>
@@ -1345,7 +1352,7 @@
           <w:color w:val="1B2A41"/>
           <w:sz w:val="25"/>
         </w:rPr>
-        <w:t xml:space="preserve">: un pago único, al principio, por el derecho a entrar. Piénsenlo como el derecho de admisión. La otra son las </w:t>
+        <w:t xml:space="preserve"> es un pago único, al inicio, por el derecho de incorporación a la red. Las </w:t>
       </w:r>
       <w:r>
         <w:rPr>
@@ -1363,7 +1370,7 @@
           <w:color w:val="1B2A41"/>
           <w:sz w:val="25"/>
         </w:rPr>
-        <w:t>: un pago que se repite todos los meses, casi siempre calculado como un porcentaje de las ventas.</w:t>
+        <w:t xml:space="preserve"> son pagos periódicos, generalmente calculados como un porcentaje de las ventas.</w:t>
       </w:r>
     </w:p>
     <w:p>
@@ -1374,7 +1381,7 @@
           <w:color w:val="1B2A41"/>
           <w:sz w:val="25"/>
         </w:rPr>
-        <w:t>Y recibe algo más que plata: recibe control. Puede exigir que el local se vea igual, que se opere igual, y que el know-how no salga de ahí.</w:t>
+        <w:t>Y recibe algo más que la contraprestación económica: recibe facultades de control. Puede exigir uniformidad en la imagen del local y en la operación, y la reserva del know-how transferido.</w:t>
       </w:r>
     </w:p>
     <w:p>
@@ -1385,7 +1392,7 @@
           <w:color w:val="1B2A41"/>
           <w:sz w:val="25"/>
         </w:rPr>
-        <w:t>Del otro lado, el franquiciado pone el dinero y el cuerpo. La inversión inicial, las regalías, el día a día del negocio, la gente. Y pone algo que la marca no tiene y necesita: sabe cómo compra la gente de su ciudad.</w:t>
+        <w:t>El franquiciado aporta capital y gestión: la inversión inicial, las regalías, la operación diaria, el equipo humano. Y aporta un activo que el franquiciador no posee: el conocimiento del comportamiento de compra en su propio mercado.</w:t>
       </w:r>
     </w:p>
     <w:p>
@@ -1396,7 +1403,7 @@
           <w:color w:val="1B2A41"/>
           <w:sz w:val="25"/>
         </w:rPr>
-        <w:t xml:space="preserve">Lo que recibe, además del paquete, es protección. La más valiosa suele ser la </w:t>
+        <w:t xml:space="preserve">A su favor, la protección más relevante suele ser la </w:t>
       </w:r>
       <w:r>
         <w:rPr>
@@ -1414,7 +1421,7 @@
           <w:color w:val="1B2A41"/>
           <w:sz w:val="25"/>
         </w:rPr>
-        <w:t>: el compromiso de que la marca no le va a abrir otro local a tres cuadras y le va a partir la clientela. Si eso no quedó escrito, no existe.</w:t>
+        <w:t>: el compromiso de que la marca no abrirá otro establecimiento en su zona de influencia fragmentando su clientela. Si no se pactó expresamente, no existe.</w:t>
       </w:r>
     </w:p>
     <w:p>
@@ -1425,25 +1432,7 @@
           <w:color w:val="1B2A41"/>
           <w:sz w:val="25"/>
         </w:rPr>
-        <w:t xml:space="preserve">Y aquí está la confusión más común. Aunque siga manuales ajenos, aunque lo auditen, aunque no pueda cambiar los precios, el franquiciado </w:t>
-      </w:r>
-      <w:r>
-        <w:rPr>
-          <w:rFonts w:ascii="Calibri" w:hAnsi="Calibri"/>
-          <w:b/>
-          <w:color w:val="1B2A41"/>
-          <w:sz w:val="25"/>
-        </w:rPr>
-        <w:t>no es un empleado</w:t>
-      </w:r>
-      <w:r>
-        <w:rPr>
-          <w:rFonts w:ascii="Calibri" w:hAnsi="Calibri"/>
-          <w:b w:val="0"/>
-          <w:color w:val="1B2A41"/>
-          <w:sz w:val="25"/>
-        </w:rPr>
-        <w:t>. Es un empresario. Su plata está en juego. Si el local quiebra, la pérdida es suya, no de la marca.</w:t>
+        <w:t>Entre sus obligaciones figura además la prohibición de competir con la red mientras el contrato esté vigente, correlato lógico de haber recibido el método.</w:t>
       </w:r>
     </w:p>
     <w:p>
@@ -1454,7 +1443,25 @@
           <w:color w:val="1B2A41"/>
           <w:sz w:val="25"/>
         </w:rPr>
-        <w:t>Eso lleva al punto que más se pelea en la práctica: quién responde cuando un cliente sufre un daño dentro del local. Por regla general responde el franquiciado, incluso por lo que hagan sus empleados, justamente porque es independiente. El letrero de la marca en la puerta no basta para responsabilizar a la marca. Pero los tribunales españoles han hecho una excepción, sobre todo en clínicas estéticas y odontológicas: cuando se prueba que el daño vino de una instrucción concreta que impuso la marca, la marca responde. Tener manuales y supervisar no alcanza; hay que probar que la orden causó el daño.</w:t>
+        <w:t xml:space="preserve">Y aquí está la confusión más frecuente. Aunque siga manuales ajenos, aunque se someta a auditorías, aunque no fije libremente sus precios, el franquiciado </w:t>
+      </w:r>
+      <w:r>
+        <w:rPr>
+          <w:rFonts w:ascii="Calibri" w:hAnsi="Calibri"/>
+          <w:b/>
+          <w:color w:val="1B2A41"/>
+          <w:sz w:val="25"/>
+        </w:rPr>
+        <w:t>no es un dependiente</w:t>
+      </w:r>
+      <w:r>
+        <w:rPr>
+          <w:rFonts w:ascii="Calibri" w:hAnsi="Calibri"/>
+          <w:b w:val="0"/>
+          <w:color w:val="1B2A41"/>
+          <w:sz w:val="25"/>
+        </w:rPr>
+        <w:t>. Es un empresario independiente. Su capital está en riesgo. Si el establecimiento fracasa, la pérdida es suya y no de la marca.</w:t>
       </w:r>
     </w:p>
     <w:p>
@@ -1465,7 +1472,18 @@
           <w:color w:val="1B2A41"/>
           <w:sz w:val="25"/>
         </w:rPr>
-        <w:t>Y cuando esto cruza fronteras aparece un tercero. Alguien compra los derechos de un país entero y después reparte franquicias ahí dentro. No es el dueño de la marca, pero para los locales de ese país se comporta como si lo fuera.</w:t>
+        <w:t>De ahí se deriva el punto de mayor litigiosidad: quién responde frente al consumidor que sufre un daño en el establecimiento. La regla general atribuye la responsabilidad al franquiciado, incluso por los actos de sus dependientes, por su condición de empresario independiente. La presencia del signo distintivo en la fachada no basta para trasladar la responsabilidad al titular de la marca. Sin embargo, los tribunales españoles han admitido una excepción, particularmente en clínicas de medicina estética y odontología: cuando se acredita que el daño derivó de una instrucción concreta impuesta por el franquiciador, este responde. La existencia de estándares y de supervisión no es suficiente; debe probarse el nexo causal.</w:t>
+      </w:r>
+    </w:p>
+    <w:p>
+      <w:r>
+        <w:rPr>
+          <w:rFonts w:ascii="Calibri" w:hAnsi="Calibri"/>
+          <w:b w:val="0"/>
+          <w:color w:val="1B2A41"/>
+          <w:sz w:val="25"/>
+        </w:rPr>
+        <w:t>Finalmente, cuando la red se internacionaliza aparece un tercer sujeto. Un operador adquiere los derechos sobre un territorio completo y otorga franquicias dentro de él. No es el titular originario de la marca, pero frente a esos franquiciados asume sus funciones.</w:t>
       </w:r>
     </w:p>
     <w:p>
@@ -1483,7 +1501,7 @@
           <w:color w:val="A8532B"/>
           <w:sz w:val="19"/>
         </w:rPr>
-        <w:t>10:35 – 12:39</w:t>
+        <w:t>10:35 – 12:37</w:t>
       </w:r>
     </w:p>
     <w:p>
@@ -1520,7 +1538,7 @@
           <w:color w:val="1B2A41"/>
           <w:sz w:val="25"/>
         </w:rPr>
-        <w:t>En la diapositiva están los doce puntos; no los voy a leer. Prefiero contarles la lógica, porque las dos listas son en realidad la misma decisión.</w:t>
+        <w:t>En la diapositiva están los doce puntos; no voy a leerlos. Prefiero detenerme en la lógica que los ordena, porque ambas columnas describen la misma decisión desde lados opuestos.</w:t>
       </w:r>
     </w:p>
     <w:p>
@@ -1531,7 +1549,7 @@
           <w:color w:val="1B2A41"/>
           <w:sz w:val="25"/>
         </w:rPr>
-        <w:t>Lo que se gana se resume en dos cosas. Se gana tiempo: uno no empieza a averiguar qué funciona, entra a algo que ya funciona. Por eso las franquicias sobreviven más que los negocios independientes; no es suerte, es que los errores caros ya los pagó otro. Y se gana escala: la publicidad, la capacitación y las compras se hacen para toda la red. Un local independiente le pide al proveedor cien unidades; la red le pide cien mil. No les cobran el mismo precio ni les dan el mismo plazo para pagar.</w:t>
+        <w:t>Lo que se obtiene se reduce a dos cosas. La primera es tiempo: no se invierte en averiguar qué funciona, se ingresa a un modelo ya validado. De ahí que las franquicias registren tasas de supervivencia superiores a las de negocios independientes comparables; no es un efecto del azar, es que los errores costosos ya fueron asumidos por otro. La segunda es escala: publicidad, capacitación y compras se ejecutan para la red completa. Un establecimiento independiente negocia cien unidades; la red negocia cien mil. No obtienen el mismo precio ni las mismas condiciones de pago.</w:t>
       </w:r>
     </w:p>
     <w:p>
@@ -1542,7 +1560,7 @@
           <w:color w:val="1B2A41"/>
           <w:sz w:val="25"/>
         </w:rPr>
-        <w:t xml:space="preserve">Lo que se pierde también son dos cosas. Se pierde plata, y de una forma que a veces no se ve venir: las regalías son un porcentaje de </w:t>
+        <w:t xml:space="preserve">Lo que se cede son también dos cosas. Se cede margen, y en una modalidad que merece precisión: las regalías se calculan sobre </w:t>
       </w:r>
       <w:r>
         <w:rPr>
@@ -1551,7 +1569,7 @@
           <w:color w:val="1B2A41"/>
           <w:sz w:val="25"/>
         </w:rPr>
-        <w:t>las ventas, no de las ganancias</w:t>
+        <w:t>las ventas, no sobre la utilidad</w:t>
       </w:r>
       <w:r>
         <w:rPr>
@@ -1560,7 +1578,7 @@
           <w:color w:val="1B2A41"/>
           <w:sz w:val="25"/>
         </w:rPr>
-        <w:t>. Si un mes las ventas caen a la mitad, la regalía se paga igual. Un mes malo para el negocio no es un mes malo para la marca.</w:t>
+        <w:t>. Si en un mes las ventas caen a la mitad, la regalía se liquida igual. Un mes adverso para el establecimiento no es un mes adverso para la marca.</w:t>
       </w:r>
     </w:p>
     <w:p>
@@ -1571,7 +1589,7 @@
           <w:color w:val="1B2A41"/>
           <w:sz w:val="25"/>
         </w:rPr>
-        <w:t>Y se pierde libertad. El franquiciado puede tener una idea excelente para su ciudad y no poder aplicarla porque el manual no lo permite. Hay algo peor todavía, que no depende de él en absoluto: si la marca queda mal en las noticias, aunque sea por algo que pasó en otro país, su local pierde clientes esa semana. Trabajó impecable y de todas formas paga la cuenta.</w:t>
+        <w:t>Y se cede autonomía. El franquiciado puede identificar una oportunidad válida en su mercado y no poder implementarla porque el manual no lo autoriza. Existe además una exposición que no controla en absoluto: si la marca sufre un deterioro reputacional, incluso por hechos ocurridos en otro país, su establecimiento pierde afluencia esa semana. Su gestión pudo ser impecable y el costo lo asume igual.</w:t>
       </w:r>
     </w:p>
     <w:p>
@@ -1582,7 +1600,7 @@
           <w:color w:val="1B2A41"/>
           <w:sz w:val="25"/>
         </w:rPr>
-        <w:t>Y ahí está el nudo del asunto: lo mismo que hace valiosa a la red es lo que le quita libertad al franquiciado. No se puede tener uno sin el otro. El contrato solo decide en qué punto se traza esa raya.</w:t>
+        <w:t>Y ahí está el núcleo del asunto: aquello que genera el valor de la red es lo mismo que restringe al franquiciado. No hay uno sin el otro. El contrato únicamente determina en qué punto se traza esa línea.</w:t>
       </w:r>
     </w:p>
     <w:p>
@@ -1600,7 +1618,7 @@
           <w:color w:val="A8532B"/>
           <w:sz w:val="19"/>
         </w:rPr>
-        <w:t>12:39 – 14:53</w:t>
+        <w:t>12:37 – 14:59</w:t>
       </w:r>
     </w:p>
     <w:p>
@@ -1657,7 +1675,7 @@
           <w:color w:val="1B2A41"/>
           <w:sz w:val="25"/>
         </w:rPr>
-        <w:t xml:space="preserve"> esto funciona porque ninguno de los dos podría solo. Uno tiene la marca y la experiencia, pero no el capital ni el conocimiento de cada ciudad. El otro tiene el capital y la ciudad, pero no la marca ni el método. La franquicia existe para juntar esas dos mitades.</w:t>
+        <w:t xml:space="preserve"> el modelo funciona porque ninguna de las partes podría sola. Una dispone de la marca, el método y la experiencia acumulada, pero no del capital ni del conocimiento de cada mercado. La otra dispone del capital y del mercado, pero no de la marca ni del método. La franquicia existe para articular esas dos mitades.</w:t>
       </w:r>
     </w:p>
     <w:p>
@@ -1677,7 +1695,7 @@
           <w:color w:val="1B2A41"/>
           <w:sz w:val="25"/>
         </w:rPr>
-        <w:t xml:space="preserve"> y es la que más me sorprendió: qué tan expuestas están las partes depende del país. Donde la ley regula la figura hay un piso mínimo de protección. Donde no, como en Colombia o en Perú, ese piso lo pone el contrato o no lo pone nadie. Un contrato mal redactado ahí no es un problema de forma: es quedarse sin defensa.</w:t>
+        <w:t xml:space="preserve"> y es la que más me llamó la atención de la investigación: el grado de exposición de las partes depende de la jurisdicción. Donde la figura está regulada existe un estándar mínimo de protección. Donde no lo está, como en Colombia o en Perú, ese estándar lo fija el contrato o no lo fija nadie. Un contrato deficiente en esas jurisdicciones no es un problema de técnica jurídica: es la ausencia de defensa.</w:t>
       </w:r>
     </w:p>
     <w:p>
@@ -1688,7 +1706,7 @@
           <w:color w:val="1B2A41"/>
           <w:sz w:val="25"/>
         </w:rPr>
-        <w:t>Y la tercera:</w:t>
+        <w:t>La tercera:</w:t>
       </w:r>
       <w:r>
         <w:rPr>
@@ -1697,7 +1715,7 @@
           <w:color w:val="1B2A41"/>
           <w:sz w:val="25"/>
         </w:rPr>
-        <w:t xml:space="preserve"> la independencia entre las partes es cierta, pero tiene un límite. Se sostiene mientras la marca oriente. Cuando la marca controla tanto que decide por el otro, esa independencia deja de ser real, y los tribunales lo han reconocido.</w:t>
+        <w:t xml:space="preserve"> la independencia entre las partes es efectiva, pero admite un límite. Se sostiene mientras el franquiciador oriente la operación. Cuando el control alcanza tal intensidad que sustituye la decisión del franquiciado, esa independencia deja de ser real, y así lo han reconocido los tribunales.</w:t>
       </w:r>
     </w:p>
     <w:p>
@@ -1708,7 +1726,7 @@
           <w:color w:val="1B2A41"/>
           <w:sz w:val="25"/>
         </w:rPr>
-        <w:t xml:space="preserve">Ahora, todo esto es teoría. Quisimos oírlo de alguien que lo hace todos los días, así que entrevistamos a </w:t>
+        <w:t xml:space="preserve">Todo lo anterior es análisis normativo y doctrinal. Para contrastarlo con la práctica, entrevistamos a </w:t>
       </w:r>
       <w:r>
         <w:rPr>
@@ -1726,7 +1744,7 @@
           <w:color w:val="1B2A41"/>
           <w:sz w:val="25"/>
         </w:rPr>
-        <w:t>, vicepresidente de operaciones de Grupo David. Lleva veinte años ahí y hoy responde por más de cuarenta franquicias.</w:t>
+        <w:t>, vicepresidente de operaciones de Grupo David, con veinte años en la organización y responsabilidad sobre más de cuarenta franquicias.</w:t>
       </w:r>
     </w:p>
     <w:p>
@@ -1737,7 +1755,7 @@
           <w:color w:val="1B2A41"/>
           <w:sz w:val="25"/>
         </w:rPr>
-        <w:t xml:space="preserve">Antes de verlo, dos términos suyos, para que no los pierdan. Va a decir </w:t>
+        <w:t xml:space="preserve">Antes de la proyección, dos términos que él emplea. </w:t>
       </w:r>
       <w:r>
         <w:rPr>
@@ -1746,7 +1764,7 @@
           <w:color w:val="1B2A41"/>
           <w:sz w:val="25"/>
         </w:rPr>
-        <w:t>brand awareness</w:t>
+        <w:t>Brand awareness</w:t>
       </w:r>
       <w:r>
         <w:rPr>
@@ -1755,7 +1773,7 @@
           <w:color w:val="1B2A41"/>
           <w:sz w:val="25"/>
         </w:rPr>
-        <w:t xml:space="preserve">: es cuánta gente conoce y quiere una marca en una ciudad determinada. Para él, eso decide si se abre o no se abre. Y va a decir </w:t>
+        <w:t xml:space="preserve"> es el nivel de reconocimiento y preferencia de marca en un mercado determinado; para él es el factor que define si una apertura procede o no procede. Y </w:t>
       </w:r>
       <w:r>
         <w:rPr>
@@ -1773,7 +1791,7 @@
           <w:color w:val="1B2A41"/>
           <w:sz w:val="25"/>
         </w:rPr>
-        <w:t>: es adaptar el producto a cada mercado, cambiar telas, colores y surtido según el clima y el gusto local. Su ejemplo lo dice todo: mandar ropa de invierno a una ciudad caliente es perder la temporada.</w:t>
+        <w:t xml:space="preserve"> es la adaptación del producto al mercado local: ajuste de materiales, colores y surtido según clima y hábitos de consumo. Su ejemplo es ilustrativo: enviar ropa de invierno a una ciudad cálida equivale a perder la temporada completa.</w:t>
       </w:r>
     </w:p>
     <w:p>
@@ -1784,7 +1802,7 @@
           <w:color w:val="1B2A41"/>
           <w:sz w:val="25"/>
         </w:rPr>
-        <w:t>Escuchen sobre todo una cosa: hasta dónde se puede adaptar el modelo sin romperlo. Eso, que aquí sonaba abstracto, para él es una decisión de todos los días.</w:t>
+        <w:t>Presten atención especialmente a un punto: hasta dónde puede adaptarse el modelo sin comprometer el estándar. Lo que aquí se plantea en términos abstractos, para él constituye una decisión operativa cotidiana.</w:t>
       </w:r>
     </w:p>
     <w:p>
@@ -1850,7 +1868,7 @@
           <w:color w:val="1B2A41"/>
           <w:sz w:val="25"/>
         </w:rPr>
-        <w:t>Como vieron, lo que sostiene una franquicia no es el texto del contrato, sino la disciplina con que se repite el estándar y la maña con que se adapta a cada mercado. Con gusto respondo sus preguntas.</w:t>
+        <w:t>La entrevista confirma algo que en el análisis apenas se intuye: lo que sostiene una franquicia no es el texto del contrato, sino el rigor con que se replica el estándar y el criterio con que se adapta a cada mercado. Con gusto respondo sus preguntas.</w:t>
       </w:r>
     </w:p>
     <w:p>
@@ -1876,7 +1894,7 @@
           <w:color w:val="1B2A41"/>
           <w:sz w:val="23"/>
         </w:rPr>
-        <w:t>¿Cuánto cuesta una franquicia?</w:t>
+        <w:t>¿Cuál es el monto de una franquicia?</w:t>
       </w:r>
     </w:p>
     <w:p>
@@ -1888,7 +1906,7 @@
           <w:color w:val="445570"/>
           <w:sz w:val="23"/>
         </w:rPr>
-        <w:t>Depende del sector y de la marca, pero siempre son dos pagos distintos: el canon de entrada, que es único y al inicio, y las regalías, que son mensuales y normalmente un porcentaje de las ventas.</w:t>
+        <w:t>Depende del sector y del posicionamiento de la marca, pero la estructura es siempre la misma: un canon de entrada, único y al inicio, y regalías periódicas calculadas normalmente como porcentaje de las ventas.</w:t>
       </w:r>
     </w:p>
     <w:p>
@@ -1901,7 +1919,7 @@
           <w:color w:val="1B2A41"/>
           <w:sz w:val="23"/>
         </w:rPr>
-        <w:t>¿El franquiciado puede vender su local?</w:t>
+        <w:t>¿Puede el franquiciado transferir su establecimiento?</w:t>
       </w:r>
     </w:p>
     <w:p>
@@ -1913,7 +1931,7 @@
           <w:color w:val="445570"/>
           <w:sz w:val="23"/>
         </w:rPr>
-        <w:t>Solo con autorización de la marca, y así suele quedar escrito. La marca quiere decidir quién entra a su red.</w:t>
+        <w:t>Solo con autorización del franquiciador, y así suele quedar pactado. La marca conserva la facultad de decidir quién se incorpora a su red.</w:t>
       </w:r>
     </w:p>
     <w:p>
@@ -1926,7 +1944,7 @@
           <w:color w:val="1B2A41"/>
           <w:sz w:val="23"/>
         </w:rPr>
-        <w:t>¿Quién responde si un cliente sufre un daño en el local?</w:t>
+        <w:t>¿Quién responde frente a un daño sufrido por un cliente en el local?</w:t>
       </w:r>
     </w:p>
     <w:p>
@@ -1938,7 +1956,7 @@
           <w:color w:val="445570"/>
           <w:sz w:val="23"/>
         </w:rPr>
-        <w:t>Por regla general el franquiciado, porque es un empresario independiente. Los tribunales españoles han responsabilizado a la marca cuando se prueba que el daño vino de una instrucción concreta que ella impuso. Tener estándares de calidad no basta: hay que probar ese nexo.</w:t>
+        <w:t>Por regla general el franquiciado, por su condición de empresario independiente. Los tribunales españoles han responsabilizado al franquiciador cuando se acredita que el daño derivó de una instrucción concreta que él impuso. La existencia de estándares de calidad no basta: debe probarse el nexo causal.</w:t>
       </w:r>
     </w:p>
     <w:p>
@@ -1951,7 +1969,7 @@
           <w:color w:val="1B2A41"/>
           <w:sz w:val="23"/>
         </w:rPr>
-        <w:t>¿Y si el franquiciado quiere cambiar algo del negocio?</w:t>
+        <w:t>¿Qué margen tiene el franquiciado para modificar la operación?</w:t>
       </w:r>
     </w:p>
     <w:p>
@@ -1963,7 +1981,7 @@
           <w:color w:val="445570"/>
           <w:sz w:val="23"/>
         </w:rPr>
-        <w:t>Necesita autorización. Un laudo arbitral colombiano, el caso PANACA, precisó que el franquiciado debe seguir la filosofía de la marca, pero que los manuales tampoco pueden aplicarse igual en cualquier ciudad.</w:t>
+        <w:t>Requiere autorización. Un laudo arbitral colombiano, el caso PANACA, precisó que el franquiciado debe respetar la filosofía de la marca, pero que los manuales tampoco pueden aplicarse de forma idéntica en cualquier plaza o mercado.</w:t>
       </w:r>
     </w:p>
     <w:p>
@@ -1988,7 +2006,7 @@
           <w:color w:val="445570"/>
           <w:sz w:val="23"/>
         </w:rPr>
-        <w:t>La licencia autoriza solo el uso del nombre. La franquicia transfiere además el know-how, los manuales, la capacitación y la asistencia continua, y viene con control sobre cómo se opera.</w:t>
+        <w:t>La licencia autoriza únicamente el uso del signo distintivo. La franquicia transfiere además el know-how, los manuales, la capacitación y la asistencia continua, y viene acompañada de facultades de control sobre la operación.</w:t>
       </w:r>
     </w:p>
     <w:p>
@@ -2001,7 +2019,7 @@
           <w:color w:val="1B2A41"/>
           <w:sz w:val="23"/>
         </w:rPr>
-        <w:t>¿Por qué en Colombia no está regulado si es tan común?</w:t>
+        <w:t>¿Por qué Colombia no ha regulado la figura pese a su difusión?</w:t>
       </w:r>
     </w:p>
     <w:p>
@@ -2013,7 +2031,7 @@
           <w:color w:val="445570"/>
           <w:sz w:val="23"/>
         </w:rPr>
-        <w:t>Hay una norma técnica voluntaria, la NTC 5813, y el Ministerio de Comercio redactó un proyecto de decreto en 2021 que preveía ese plazo de veinte días. Cuando hicimos esta revisión, el proyecto seguía sin expedirse.</w:t>
+        <w:t>Existe una norma técnica de aplicación voluntaria, la NTC 5813, y el Ministerio de Comercio redactó en 2021 un proyecto de decreto que contemplaba ese plazo de veinte días hábiles. A la fecha de nuestra revisión, el proyecto seguía sin expedirse.</w:t>
       </w:r>
     </w:p>
     <w:p>
@@ -2026,7 +2044,7 @@
           <w:color w:val="1B2A41"/>
           <w:sz w:val="23"/>
         </w:rPr>
-        <w:t>¿Cuánto durará el contrato normalmente?</w:t>
+        <w:t>¿Cuál es la duración habitual del contrato?</w:t>
       </w:r>
     </w:p>
     <w:p>
@@ -2038,7 +2056,7 @@
           <w:color w:val="445570"/>
           <w:sz w:val="23"/>
         </w:rPr>
-        <w:t>Lo fija el contrato y varía mucho, pero siempre trae cláusulas de renovación y de terminación. Es una relación de larga duración: por eso se negocia la salida desde el principio.</w:t>
+        <w:t>La fija el contrato y varía según el sector, pero siempre incorpora cláusulas de renovación y de terminación. Se trata de una relación de larga duración, y por eso la salida se negocia desde el inicio.</w:t>
       </w:r>
     </w:p>
     <w:sectPr>

</xml_diff>

<commit_message>
Reescribir el guion en lenguaje hablado natural
La versión anterior se había ido al extremo opuesto del coloquial: quedó
como un escrito jurídico. Se elimina la jerga y las nominalizaciones
burocráticas (contraprestación, activos intangibles, dimensionamiento del
personal, litigiosidad, criterio restrictivo, se acredita, correlato) y se
pasa a frases cortas con verbos, que es como se explica algo hablando.

Ejemplos del cambio: «La regla general atribuye la responsabilidad al
franquiciado por su condición de empresario independiente» pasa a «En
principio responde el franquiciado, precisamente porque es independiente».
Y «Su contraprestación llega por dos vías que no deben confundirse» pasa a
«Cobra de dos maneras distintas, y no son lo mismo».

Los términos que el público no conoce siguen explicados en una frase llana,
sin analogías infantiles y sin paráfrasis escolar.
</commit_message>
<xml_diff>
--- a/Guion exposicion - Contrato de franquicia.docx
+++ b/Guion exposicion - Contrato de franquicia.docx
@@ -50,7 +50,7 @@
           <w:color w:val="707886"/>
           <w:sz w:val="22"/>
         </w:rPr>
-        <w:t>El video de la entrevista se proyecta después de los quince minutos, de modo que estos quince corresponden íntegramente a la exposición. La diapositiva 6 la cierra y deja el video montado. Leído a ritmo normal, unas 140 palabras por minuto, el guion completo da 14:59.</w:t>
+        <w:t>El video de la entrevista se proyecta después de los quince minutos, así que estos quince son todos de exposición. La diapositiva 6 la cierra y deja el video montado. Leído a ritmo normal, unas 140 palabras por minuto, el guion completo da 15:03.</w:t>
       </w:r>
     </w:p>
     <w:tbl>
@@ -195,7 +195,7 @@
                 <w:color w:val="1B2A41"/>
                 <w:sz w:val="20"/>
               </w:rPr>
-              <w:t>1:08</w:t>
+              <w:t>1:11</w:t>
             </w:r>
           </w:p>
         </w:tc>
@@ -221,7 +221,7 @@
                 <w:color w:val="1B2A41"/>
                 <w:sz w:val="20"/>
               </w:rPr>
-              <w:t>1:08</w:t>
+              <w:t>1:11</w:t>
             </w:r>
           </w:p>
         </w:tc>
@@ -269,7 +269,7 @@
                 <w:color w:val="1B2A41"/>
                 <w:sz w:val="20"/>
               </w:rPr>
-              <w:t>3:32</w:t>
+              <w:t>3:37</w:t>
             </w:r>
           </w:p>
         </w:tc>
@@ -295,7 +295,7 @@
                 <w:color w:val="1B2A41"/>
                 <w:sz w:val="20"/>
               </w:rPr>
-              <w:t>4:40</w:t>
+              <w:t>4:49</w:t>
             </w:r>
           </w:p>
         </w:tc>
@@ -343,7 +343,7 @@
                 <w:color w:val="1B2A41"/>
                 <w:sz w:val="20"/>
               </w:rPr>
-              <w:t>2:37</w:t>
+              <w:t>2:47</w:t>
             </w:r>
           </w:p>
         </w:tc>
@@ -369,7 +369,7 @@
                 <w:color w:val="1B2A41"/>
                 <w:sz w:val="20"/>
               </w:rPr>
-              <w:t>7:17</w:t>
+              <w:t>7:36</w:t>
             </w:r>
           </w:p>
         </w:tc>
@@ -443,7 +443,7 @@
                 <w:color w:val="1B2A41"/>
                 <w:sz w:val="20"/>
               </w:rPr>
-              <w:t>10:35</w:t>
+              <w:t>10:54</w:t>
             </w:r>
           </w:p>
         </w:tc>
@@ -491,7 +491,7 @@
                 <w:color w:val="1B2A41"/>
                 <w:sz w:val="20"/>
               </w:rPr>
-              <w:t>2:02</w:t>
+              <w:t>1:57</w:t>
             </w:r>
           </w:p>
         </w:tc>
@@ -517,7 +517,7 @@
                 <w:color w:val="1B2A41"/>
                 <w:sz w:val="20"/>
               </w:rPr>
-              <w:t>12:37</w:t>
+              <w:t>12:51</w:t>
             </w:r>
           </w:p>
         </w:tc>
@@ -565,7 +565,7 @@
                 <w:color w:val="1B2A41"/>
                 <w:sz w:val="20"/>
               </w:rPr>
-              <w:t>2:21</w:t>
+              <w:t>2:12</w:t>
             </w:r>
           </w:p>
         </w:tc>
@@ -592,7 +592,7 @@
                 <w:color w:val="A8532B"/>
                 <w:sz w:val="20"/>
               </w:rPr>
-              <w:t>14:59</w:t>
+              <w:t>15:03</w:t>
             </w:r>
           </w:p>
         </w:tc>
@@ -670,7 +670,7 @@
           <w:color w:val="707886"/>
           <w:sz w:val="21"/>
         </w:rPr>
-        <w:t>Para recuperar unos 50 segundos: en la diapositiva 4, omitir el párrafo sobre responsabilidad frente al consumidor.</w:t>
+        <w:t>Para recuperar unos 50 segundos: en la diapositiva 4, saltarse el párrafo de quién responde ante un daño al cliente.</w:t>
       </w:r>
     </w:p>
     <w:p>
@@ -683,7 +683,7 @@
           <w:color w:val="707886"/>
           <w:sz w:val="21"/>
         </w:rPr>
-        <w:t>Para recuperar unos 20 segundos: en la diapositiva 5, suprimir el caso del deterioro reputacional.</w:t>
+        <w:t>Para recuperar unos 20 segundos: en la diapositiva 5, saltarse el caso del golpe a la reputación de la marca.</w:t>
       </w:r>
     </w:p>
     <w:p>
@@ -696,7 +696,7 @@
           <w:color w:val="707886"/>
           <w:sz w:val="21"/>
         </w:rPr>
-        <w:t>Si sobra tiempo: desarrollar los ejemplos de la diapositiva 5, que es donde la explicación gana concreción.</w:t>
+        <w:t>Si sobra tiempo: desarrollar los ejemplos de la diapositiva 5, que es donde la explicación se vuelve concreta.</w:t>
       </w:r>
     </w:p>
     <w:p>
@@ -714,7 +714,7 @@
           <w:color w:val="A8532B"/>
           <w:sz w:val="19"/>
         </w:rPr>
-        <w:t>0:00 – 1:08</w:t>
+        <w:t>0:00 – 1:11</w:t>
       </w:r>
     </w:p>
     <w:p>
@@ -780,7 +780,7 @@
           <w:color w:val="1B2A41"/>
           <w:sz w:val="25"/>
         </w:rPr>
-        <w:t>Toda empresa que decide crecer enfrenta la misma restricción: la expansión exige capital, y el capital propio siempre es limitado. Las respuestas habituales son endeudarse o abrir más despacio. La franquicia plantea una tercera: expandirse con capital de terceros, cediéndoles el derecho a operar bajo la marca.</w:t>
+        <w:t>Cualquier empresa que quiere crecer se topa con el mismo límite: abrir puntos nuevos cuesta capital, y el propio alcanza hasta cierto punto. Las salidas de siempre son endeudarse o crecer más lento.</w:t>
       </w:r>
     </w:p>
     <w:p>
@@ -791,7 +791,7 @@
           <w:color w:val="1B2A41"/>
           <w:sz w:val="25"/>
         </w:rPr>
-        <w:t>El costo de esa decisión es alto. Obliga a entregarle a un tercero lo único que sostiene el valor de la empresa —su nombre y su forma de trabajar— y a confiar en que lo ejecutará con el mismo estándar, en un mercado donde el titular no está presente.</w:t>
+        <w:t>La franquicia propone otra: crecer con el dinero de otros. Alguien más pone la inversión, abre el local y lo opera bajo tu marca.</w:t>
       </w:r>
     </w:p>
     <w:p>
@@ -802,7 +802,18 @@
           <w:color w:val="1B2A41"/>
           <w:sz w:val="25"/>
         </w:rPr>
-        <w:t>El contrato de franquicia es el instrumento que vuelve administrable esa decisión. Define qué se transfiere, qué se cobra, qué se controla y qué ocurre cuando la relación se rompe. En los próximos quince minutos voy a recorrer cómo está construido, quiénes intervienen y qué asume cada parte.</w:t>
+        <w:t>Suena cómodo, pero tiene un precio alto. Para que funcione hay que entregarle a un tercero lo único que de verdad vale en la empresa: el nombre y la forma de trabajar. Y después confiar en que lo va a hacer igual de bien en una ciudad donde uno no está para vigilarlo.</w:t>
+      </w:r>
+    </w:p>
+    <w:p>
+      <w:r>
+        <w:rPr>
+          <w:rFonts w:ascii="Calibri" w:hAnsi="Calibri"/>
+          <w:b w:val="0"/>
+          <w:color w:val="1B2A41"/>
+          <w:sz w:val="25"/>
+        </w:rPr>
+        <w:t>El contrato de franquicia es lo que vuelve manejable ese riesgo. Ahí queda definido qué se entrega, qué se cobra, qué se controla y qué pasa cuando la relación se rompe. Eso es lo que voy a explicar en estos quince minutos.</w:t>
       </w:r>
     </w:p>
     <w:p>
@@ -820,7 +831,7 @@
           <w:color w:val="A8532B"/>
           <w:sz w:val="19"/>
         </w:rPr>
-        <w:t>1:08 – 4:40</w:t>
+        <w:t>1:11 – 4:49</w:t>
       </w:r>
     </w:p>
     <w:p>
@@ -857,7 +868,7 @@
           <w:color w:val="1B2A41"/>
           <w:sz w:val="25"/>
         </w:rPr>
-        <w:t>Franquiciar no consiste en vender un producto, sino en transferir la capacidad de reproducir un negocio. Esa capacidad se compone de tres elementos, con naturaleza y valor distintos.</w:t>
+        <w:t>Cuando una empresa franquicia, no está vendiendo un producto. Está vendiendo la capacidad de repetir su negocio. Y eso son tres cosas distintas.</w:t>
       </w:r>
     </w:p>
     <w:p>
@@ -868,7 +879,7 @@
           <w:color w:val="1B2A41"/>
           <w:sz w:val="25"/>
         </w:rPr>
-        <w:t>El primero es la marca. Su función económica es concreta: le ahorra al nuevo establecimiento los años que toma construir reputación en un mercado. El cliente ingresa con una expectativa ya formada.</w:t>
+        <w:t>La primera es la marca, y sirve para algo muy concreto: el local nuevo se ahorra los años que cuesta que la gente confíe en un nombre. El cliente entra sabiendo qué va a encontrar.</w:t>
       </w:r>
     </w:p>
     <w:p>
@@ -879,7 +890,7 @@
           <w:color w:val="1B2A41"/>
           <w:sz w:val="25"/>
         </w:rPr>
-        <w:t xml:space="preserve">El segundo es el </w:t>
+        <w:t xml:space="preserve">La segunda es el </w:t>
       </w:r>
       <w:r>
         <w:rPr>
@@ -897,7 +908,7 @@
           <w:color w:val="1B2A41"/>
           <w:sz w:val="25"/>
         </w:rPr>
-        <w:t>, y es donde reside el valor real del sistema. Se traduce como saber hacer, y comprende el conjunto de procedimientos que la empresa depuró a lo largo de años de operación: estándares de producción, dimensionamiento del personal, protocolos de atención, manejo de reclamos, control de inventarios. No es materia patentable, porque no se trata de una invención sino de experiencia acumulada, buena parte de ella a costa de errores costosos. Al franquiciar, todo eso se documenta en manuales y se entrega a un tercero. De ahí la severidad de las cláusulas de confidencialidad: el franquiciado queda autorizado a utilizarlo, no a divulgarlo, y esa obligación sobrevive a la terminación del contrato.</w:t>
+        <w:t>, y ahí está el valor de verdad. Es un término del inglés que significa saber hacer. Son todos los procedimientos que la empresa fue afinando con los años: cómo se prepara cada producto, cuánta gente hace falta en cada turno, qué se hace cuando un cliente reclama, cómo se maneja el inventario. Nada de eso se puede patentar, porque no es un invento: es experiencia, y buena parte se aprendió cometiendo errores caros. Al franquiciar, todo eso se pone por escrito en manuales y se le entrega a alguien de afuera. Por eso las cláusulas de confidencialidad son tan duras: el franquiciado lo puede usar, pero no lo puede contar, y esa obligación le sigue aunque el contrato termine.</w:t>
       </w:r>
     </w:p>
     <w:p>
@@ -908,7 +919,7 @@
           <w:color w:val="1B2A41"/>
           <w:sz w:val="25"/>
         </w:rPr>
-        <w:t>El tercero es el sistema de operación: configuración del local, protocolo de servicio, política publicitaria. No responde a un criterio estético, sino a la necesidad de que dos establecimientos con propietarios distintos resulten indistinguibles para el consumidor.</w:t>
+        <w:t>La tercera es la forma de operar: cómo se ve el local, cómo se atiende, cómo se hace la publicidad. No es un tema de gusto. Es lo que permite que dos locales con dueños distintos le resulten iguales al cliente.</w:t>
       </w:r>
     </w:p>
     <w:p>
@@ -919,7 +930,7 @@
           <w:color w:val="1B2A41"/>
           <w:sz w:val="25"/>
         </w:rPr>
-        <w:t>Esos tres elementos, en conjunto, constituyen la franquicia.</w:t>
+        <w:t>Esas tres cosas juntas son la franquicia.</w:t>
       </w:r>
     </w:p>
     <w:p>
@@ -930,7 +941,7 @@
           <w:color w:val="1B2A41"/>
           <w:sz w:val="25"/>
         </w:rPr>
-        <w:t>El contrato opera en otro plano. Es el instrumento donde se fijan la contraprestación, el plazo, el territorio, las facultades de cada parte y las consecuencias del incumplimiento. Presenta dos particularidades que lo separan de la contratación mercantil ordinaria.</w:t>
+        <w:t>El contrato es otra cosa. Es el documento donde se fija cuánto se paga, por cuánto tiempo, en qué zona, qué puede hacer cada uno y qué pasa si alguien incumple. Y tiene dos rasgos que lo diferencian de un contrato comercial común.</w:t>
       </w:r>
     </w:p>
     <w:p>
@@ -941,7 +952,7 @@
           <w:color w:val="1B2A41"/>
           <w:sz w:val="25"/>
         </w:rPr>
-        <w:t>La primera: no se agota en un acto. En una compraventa hay una prestación, una contraprestación y la relación se extingue. Aquí la relación permanece activa durante toda la vigencia, con pagos periódicos, asistencia continua y supervisión permanente. Su estructura se aproxima más al arrendamiento que a la compraventa.</w:t>
+        <w:t>El primero: no se cumple y se termina. En una compraventa uno paga, el otro entrega y ahí queda. Acá la relación sigue viva todo el tiempo que dure: hay pagos cada mes, asistencia permanente y supervisión constante. Se parece más a un arriendo que a una compra.</w:t>
       </w:r>
     </w:p>
     <w:p>
@@ -952,7 +963,7 @@
           <w:color w:val="1B2A41"/>
           <w:sz w:val="25"/>
         </w:rPr>
-        <w:t xml:space="preserve">La segunda es menos evidente: el contrato es </w:t>
+        <w:t xml:space="preserve">El segundo es menos evidente: el contrato está </w:t>
       </w:r>
       <w:r>
         <w:rPr>
@@ -961,7 +972,7 @@
           <w:color w:val="1B2A41"/>
           <w:sz w:val="25"/>
         </w:rPr>
-        <w:t>deliberadamente incompleto</w:t>
+        <w:t>incompleto a propósito</w:t>
       </w:r>
       <w:r>
         <w:rPr>
@@ -970,7 +981,7 @@
           <w:color w:val="1B2A41"/>
           <w:sz w:val="25"/>
         </w:rPr>
-        <w:t>. Ninguno anticipa un cambio en los hábitos de consumo a ocho años, ni una contingencia sanitaria. Y no se trata de una deficiencia de redacción. Un contrato que cerrara todas las variables impediría a la red ajustarse cuando el mercado se desplaza. Ese margen es lo que le da capacidad de adaptación.</w:t>
+        <w:t>. Ninguno prevé que en ocho años la gente compre de otra manera, ni que aparezca una pandemia. Y no es que el abogado lo haya hecho mal. Un contrato que amarre todas las variables le impide a la red moverse cuando el mercado se mueve. Ese margen es lo que le da capacidad de adaptarse.</w:t>
       </w:r>
     </w:p>
     <w:p>
@@ -981,7 +992,7 @@
           <w:color w:val="1B2A41"/>
           <w:sz w:val="25"/>
         </w:rPr>
-        <w:t xml:space="preserve">A ello se suma su condición de </w:t>
+        <w:t xml:space="preserve">Hay algo más: es un </w:t>
       </w:r>
       <w:r>
         <w:rPr>
@@ -999,7 +1010,7 @@
           <w:color w:val="1B2A41"/>
           <w:sz w:val="25"/>
         </w:rPr>
-        <w:t>: no regula una operación aislada, sino la incorporación a una red. Por eso las obligaciones del franquiciado no derivan únicamente del texto pactado, sino también de la ejecución cotidiana del know-how dentro de ese sistema.</w:t>
+        <w:t>. No regula una operación puntual, regula la entrada a una red. Por eso las obligaciones del franquiciado no salen solo del texto que firmó; también salen de operar el negocio todos los días según ese método.</w:t>
       </w:r>
     </w:p>
     <w:p>
@@ -1010,7 +1021,7 @@
           <w:color w:val="1B2A41"/>
           <w:sz w:val="25"/>
         </w:rPr>
-        <w:t xml:space="preserve">Por último, el grado de protección varía según la jurisdicción. </w:t>
+        <w:t xml:space="preserve">Y una advertencia que cambia según el país. </w:t>
       </w:r>
       <w:r>
         <w:rPr>
@@ -1028,7 +1039,7 @@
           <w:color w:val="1B2A41"/>
           <w:sz w:val="25"/>
         </w:rPr>
-        <w:t xml:space="preserve"> tipificó la figura en su Código Civil y Comercial: ante un litigio existen artículos aplicables. </w:t>
+        <w:t xml:space="preserve"> metió la franquicia en su Código Civil y Comercial: si hay un pleito, hay artículos que aplicar. </w:t>
       </w:r>
       <w:r>
         <w:rPr>
@@ -1064,7 +1075,7 @@
           <w:color w:val="1B2A41"/>
           <w:sz w:val="25"/>
         </w:rPr>
-        <w:t xml:space="preserve"> la mantienen como contrato atípico, es decir, la ley no la nombra. No es una figura ilegal, pero implica que lo que el contrato no prevea, no lo prevé nadie. En esas jurisdicciones el contrato no respalda el acuerdo: lo constituye por completo.</w:t>
+        <w:t xml:space="preserve"> la tratan como contrato atípico, o sea que la ley no la menciona. No es ilegal, pero implica que lo que el contrato no diga, no lo dice nadie. Ahí el contrato no respalda el acuerdo: el contrato es el acuerdo.</w:t>
       </w:r>
     </w:p>
     <w:p>
@@ -1082,7 +1093,7 @@
           <w:color w:val="A8532B"/>
           <w:sz w:val="19"/>
         </w:rPr>
-        <w:t>4:40 – 7:17</w:t>
+        <w:t>4:49 – 7:36</w:t>
       </w:r>
     </w:p>
     <w:p>
@@ -1119,7 +1130,7 @@
           <w:color w:val="1B2A41"/>
           <w:sz w:val="25"/>
         </w:rPr>
-        <w:t>El ciclo tiene cinco etapas, y la primera no es la firma: es la selección.</w:t>
+        <w:t>El proceso tiene cinco etapas, y la primera no es firmar: es elegir.</w:t>
       </w:r>
     </w:p>
     <w:p>
@@ -1130,7 +1141,7 @@
           <w:color w:val="1B2A41"/>
           <w:sz w:val="25"/>
         </w:rPr>
-        <w:t>El titular de la marca evalúa candidatos con criterio restrictivo, porque cada establecimiento que abre compromete su nombre. La capacidad de inversión no es suficiente. La literatura especializada identifica la selección de franquiciados como una de las decisiones determinantes del desempeño del sistema completo, y la razón es asimétrica: si el franquiciado opera mal, él pierde su inversión, pero la marca pierde posicionamiento en todo el mercado.</w:t>
+        <w:t>La marca no le da una franquicia a cualquiera que tenga el dinero. Evalúa candidatos, y los evalúa con cuidado, porque cada local que abre lleva su nombre en la fachada. Los estudios coinciden en que elegir bien al franquiciado es una de las decisiones que más determina si la red funciona. Y el riesgo no se reparte igual: si opera mal, él pierde su inversión, pero la marca pierde prestigio en todo el mercado.</w:t>
       </w:r>
     </w:p>
     <w:p>
@@ -1141,7 +1152,7 @@
           <w:color w:val="1B2A41"/>
           <w:sz w:val="25"/>
         </w:rPr>
-        <w:t>Alcanzado el acuerdo, se formaliza. Y en ese momento no solo se define el precio: se define la salida. Plazo, condiciones de renovación, causales de terminación anticipada y mecanismo de solución de controversias. Todo eso se pacta al inicio, cuando existe voluntad de acuerdo, precisamente porque después no la habrá.</w:t>
+        <w:t>Cuando hay acuerdo, se firma. Y ahí no solo se pacta el precio: se pacta la salida. Cuánto dura, cómo se renueva, en qué casos se puede cortar antes y quién decide si hay conflicto. Todo eso se define al principio, mientras las dos partes se están llevando bien, justamente porque después no se van a poner de acuerdo.</w:t>
       </w:r>
     </w:p>
     <w:p>
@@ -1152,7 +1163,7 @@
           <w:color w:val="1B2A41"/>
           <w:sz w:val="25"/>
         </w:rPr>
-        <w:t>Sigue la transferencia y la capacitación, que es la etapa menos visible y una de las más determinantes: entrenamiento del propietario y del personal, entrega de manuales, acompañamiento en la apertura. Es aquí donde el know-how cambia de titular en términos prácticos.</w:t>
+        <w:t>Después viene la etapa que nadie ve y que es de las más importantes: la capacitación. Se entrena al dueño y al personal, se entregan los manuales, se acompaña la apertura. Ahí es donde el know-how cambia de manos en la práctica.</w:t>
       </w:r>
     </w:p>
     <w:p>
@@ -1163,7 +1174,7 @@
           <w:color w:val="1B2A41"/>
           <w:sz w:val="25"/>
         </w:rPr>
-        <w:t>Luego opera el establecimiento. El franquiciado asume la gestión completa —contratación, nómina, atención, obligaciones locales— pero la ejerce dentro de parámetros que no definió.</w:t>
+        <w:t>El local abre. Y el franquiciado lleva el negocio completo: contrata, paga la nómina, atiende, responde por el arriendo. Pero lo hace dentro de reglas que no escribió él.</w:t>
       </w:r>
     </w:p>
     <w:p>
@@ -1174,7 +1185,7 @@
           <w:color w:val="1B2A41"/>
           <w:sz w:val="25"/>
         </w:rPr>
-        <w:t>Y la relación no termina ahí: continúa la supervisión. Visitas, verificación de estándares, auditoría de instalaciones y, en muchos contratos, revisión de los libros contables. Es una facultad intrusiva, y está aceptada desde el inicio por una razón práctica: cuando el servicio falla, el consumidor no atribuye la falla al propietario del local, la atribuye a la marca. El costo reputacional se distribuye sobre toda la red.</w:t>
+        <w:t>Y la marca no desaparece: vuelve. Visita el local, revisa que se cumplan los estándares, audita las instalaciones y en muchos contratos también los libros contables. Es una facultad incómoda, y está aceptada desde el primer día por una razón práctica: cuando algo sale mal, el cliente no culpa al dueño del local, culpa a la marca. El daño se reparte entre todos los que están en la red.</w:t>
       </w:r>
     </w:p>
     <w:p>
@@ -1185,7 +1196,7 @@
           <w:color w:val="1B2A41"/>
           <w:sz w:val="25"/>
         </w:rPr>
-        <w:t xml:space="preserve">Hay además una obligación previa a todo el ciclo, que a mi juicio es la que mejor caracteriza esta figura. Antes de la firma, el titular de la marca debe entregar al futuro franquiciado información veraz sobre el negocio: su identidad, la situación del sector, la estructura de la red. Y con </w:t>
+        <w:t xml:space="preserve">Hay una obligación anterior a todo esto que para mí es lo más interesante de la figura. Antes de firmar, la marca tiene que entregarle al futuro franquiciado información real del negocio: quién es, cómo está el sector, cómo está armada la red. Y con </w:t>
       </w:r>
       <w:r>
         <w:rPr>
@@ -1203,7 +1214,7 @@
           <w:color w:val="1B2A41"/>
           <w:sz w:val="25"/>
         </w:rPr>
-        <w:t xml:space="preserve"> de anticipación, para que la decisión se adopte con información completa. El fundamento es la asimetría: quien ofrece conoce el negocio en detalle y quien invierte lo desconoce casi por completo. El incumplimiento de este deber genera responsabilidad por daños </w:t>
+        <w:t xml:space="preserve"> de anticipación, para que decida con todo sobre la mesa. Existe porque la diferencia de información es enorme: el que ofrece conoce el negocio a fondo y el que invierte casi no lo conoce. Y si esa información se esconde o se maquilla, hay responsabilidad por daños </w:t>
       </w:r>
       <w:r>
         <w:rPr>
@@ -1212,7 +1223,7 @@
           <w:color w:val="1B2A41"/>
           <w:sz w:val="25"/>
         </w:rPr>
-        <w:t>aunque el contrato nunca llegue a celebrarse</w:t>
+        <w:t>aunque el contrato no se llegue a firmar</w:t>
       </w:r>
       <w:r>
         <w:rPr>
@@ -1239,7 +1250,7 @@
           <w:color w:val="A8532B"/>
           <w:sz w:val="19"/>
         </w:rPr>
-        <w:t>7:17 – 10:35</w:t>
+        <w:t>7:36 – 10:54</w:t>
       </w:r>
     </w:p>
     <w:p>
@@ -1276,7 +1287,7 @@
           <w:color w:val="1B2A41"/>
           <w:sz w:val="25"/>
         </w:rPr>
-        <w:t xml:space="preserve">Intervienen dos partes, con denominaciones que se confunden con facilidad. El </w:t>
+        <w:t xml:space="preserve">Son dos partes, y los nombres se parecen tanto que se confunden. El </w:t>
       </w:r>
       <w:r>
         <w:rPr>
@@ -1294,7 +1305,7 @@
           <w:color w:val="1B2A41"/>
           <w:sz w:val="25"/>
         </w:rPr>
-        <w:t xml:space="preserve">, también llamado franquiciante u otorgante, es el titular de la marca. El </w:t>
+        <w:t xml:space="preserve">, que también se llama franquiciante u otorgante, es el dueño de la marca. El </w:t>
       </w:r>
       <w:r>
         <w:rPr>
@@ -1312,7 +1323,7 @@
           <w:color w:val="1B2A41"/>
           <w:sz w:val="25"/>
         </w:rPr>
-        <w:t>, o franquiciatario, es quien explota el establecimiento.</w:t>
+        <w:t>, o franquiciatario, es el que abre y opera el local.</w:t>
       </w:r>
     </w:p>
     <w:p>
@@ -1323,7 +1334,7 @@
           <w:color w:val="1B2A41"/>
           <w:sz w:val="25"/>
         </w:rPr>
-        <w:t>El franquiciador aporta activos intangibles: el nombre comercial, el know-how, los manuales y la asistencia técnica. Y hay un requisito previo que suele omitirse: para franquiciar debió haber operado con éxito su propio negocio durante un período razonable. No se franquicia un proyecto; se franquicia un historial acreditado. Ese historial es lo que determina el valor de lo que ofrece.</w:t>
+        <w:t>Lo que aporta el dueño de la marca no se puede tocar: el nombre, el know-how, los manuales y la asistencia técnica. Y hay un requisito previo del que casi no se habla: para poder franquiciar tuvo que haber operado su propio negocio con éxito durante un buen tiempo. No se franquicia una idea, se franquicia un historial. Y ese historial define cuánto vale lo que ofrece.</w:t>
       </w:r>
     </w:p>
     <w:p>
@@ -1334,7 +1345,7 @@
           <w:color w:val="1B2A41"/>
           <w:sz w:val="25"/>
         </w:rPr>
-        <w:t xml:space="preserve">Su contraprestación llega por dos vías que no deben confundirse. El </w:t>
+        <w:t xml:space="preserve">Cobra de dos maneras distintas, y no son lo mismo. El </w:t>
       </w:r>
       <w:r>
         <w:rPr>
@@ -1352,7 +1363,7 @@
           <w:color w:val="1B2A41"/>
           <w:sz w:val="25"/>
         </w:rPr>
-        <w:t xml:space="preserve"> es un pago único, al inicio, por el derecho de incorporación a la red. Las </w:t>
+        <w:t xml:space="preserve"> es un pago único, al principio, por el derecho a entrar a la red. Las </w:t>
       </w:r>
       <w:r>
         <w:rPr>
@@ -1370,7 +1381,7 @@
           <w:color w:val="1B2A41"/>
           <w:sz w:val="25"/>
         </w:rPr>
-        <w:t xml:space="preserve"> son pagos periódicos, generalmente calculados como un porcentaje de las ventas.</w:t>
+        <w:t xml:space="preserve"> son pagos que se repiten cada mes, y normalmente se calculan como un porcentaje de las ventas.</w:t>
       </w:r>
     </w:p>
     <w:p>
@@ -1381,7 +1392,7 @@
           <w:color w:val="1B2A41"/>
           <w:sz w:val="25"/>
         </w:rPr>
-        <w:t>Y recibe algo más que la contraprestación económica: recibe facultades de control. Puede exigir uniformidad en la imagen del local y en la operación, y la reserva del know-how transferido.</w:t>
+        <w:t>Y además del dinero recibe control. Puede exigir que el local se vea igual, que se opere igual, y que el know-how no salga de ahí.</w:t>
       </w:r>
     </w:p>
     <w:p>
@@ -1392,7 +1403,7 @@
           <w:color w:val="1B2A41"/>
           <w:sz w:val="25"/>
         </w:rPr>
-        <w:t>El franquiciado aporta capital y gestión: la inversión inicial, las regalías, la operación diaria, el equipo humano. Y aporta un activo que el franquiciador no posee: el conocimiento del comportamiento de compra en su propio mercado.</w:t>
+        <w:t>Del otro lado, el franquiciado pone el capital y la gestión: la inversión inicial, las regalías, el día a día, el equipo. Y pone algo que la marca no tiene: sabe cómo compra la gente de su ciudad.</w:t>
       </w:r>
     </w:p>
     <w:p>
@@ -1403,7 +1414,7 @@
           <w:color w:val="1B2A41"/>
           <w:sz w:val="25"/>
         </w:rPr>
-        <w:t xml:space="preserve">A su favor, la protección más relevante suele ser la </w:t>
+        <w:t xml:space="preserve">A cambio recibe el paquete completo y, sobre todo, protección. La más importante suele ser la </w:t>
       </w:r>
       <w:r>
         <w:rPr>
@@ -1421,7 +1432,7 @@
           <w:color w:val="1B2A41"/>
           <w:sz w:val="25"/>
         </w:rPr>
-        <w:t>: el compromiso de que la marca no abrirá otro establecimiento en su zona de influencia fragmentando su clientela. Si no se pactó expresamente, no existe.</w:t>
+        <w:t>: el compromiso de que la marca no va a abrir otro local en su zona y le va a dividir la clientela. Si no quedó escrito, no existe.</w:t>
       </w:r>
     </w:p>
     <w:p>
@@ -1432,7 +1443,7 @@
           <w:color w:val="1B2A41"/>
           <w:sz w:val="25"/>
         </w:rPr>
-        <w:t>Entre sus obligaciones figura además la prohibición de competir con la red mientras el contrato esté vigente, correlato lógico de haber recibido el método.</w:t>
+        <w:t>Entre sus obligaciones está no competir con la red mientras el contrato esté vigente, que es la contracara de haberle recibido el método.</w:t>
       </w:r>
     </w:p>
     <w:p>
@@ -1443,7 +1454,7 @@
           <w:color w:val="1B2A41"/>
           <w:sz w:val="25"/>
         </w:rPr>
-        <w:t xml:space="preserve">Y aquí está la confusión más frecuente. Aunque siga manuales ajenos, aunque se someta a auditorías, aunque no fije libremente sus precios, el franquiciado </w:t>
+        <w:t xml:space="preserve">Y acá está la confusión más común. Aunque siga manuales ajenos, aunque lo auditen, aunque no fije sus precios, el franquiciado </w:t>
       </w:r>
       <w:r>
         <w:rPr>
@@ -1452,7 +1463,7 @@
           <w:color w:val="1B2A41"/>
           <w:sz w:val="25"/>
         </w:rPr>
-        <w:t>no es un dependiente</w:t>
+        <w:t>no es un empleado</w:t>
       </w:r>
       <w:r>
         <w:rPr>
@@ -1461,7 +1472,7 @@
           <w:color w:val="1B2A41"/>
           <w:sz w:val="25"/>
         </w:rPr>
-        <w:t>. Es un empresario independiente. Su capital está en riesgo. Si el establecimiento fracasa, la pérdida es suya y no de la marca.</w:t>
+        <w:t>. Es un empresario independiente. Su capital está en riesgo. Si el local quiebra, la pérdida es suya y no de la marca.</w:t>
       </w:r>
     </w:p>
     <w:p>
@@ -1472,7 +1483,7 @@
           <w:color w:val="1B2A41"/>
           <w:sz w:val="25"/>
         </w:rPr>
-        <w:t>De ahí se deriva el punto de mayor litigiosidad: quién responde frente al consumidor que sufre un daño en el establecimiento. La regla general atribuye la responsabilidad al franquiciado, incluso por los actos de sus dependientes, por su condición de empresario independiente. La presencia del signo distintivo en la fachada no basta para trasladar la responsabilidad al titular de la marca. Sin embargo, los tribunales españoles han admitido una excepción, particularmente en clínicas de medicina estética y odontología: cuando se acredita que el daño derivó de una instrucción concreta impuesta por el franquiciador, este responde. La existencia de estándares y de supervisión no es suficiente; debe probarse el nexo causal.</w:t>
+        <w:t>De ahí sale el punto que más se pelea en tribunales: quién responde cuando un cliente sufre un daño dentro del local. En principio responde el franquiciado, incluso por lo que hagan sus empleados, precisamente porque es independiente. Que el aviso de la marca esté en la puerta no alcanza para responsabilizarla. Pero los tribunales españoles hicieron una excepción, sobre todo en clínicas de estética y odontología: si se prueba que el daño vino de una instrucción concreta de la marca, la marca responde. Tener manuales y supervisar no basta.</w:t>
       </w:r>
     </w:p>
     <w:p>
@@ -1483,7 +1494,7 @@
           <w:color w:val="1B2A41"/>
           <w:sz w:val="25"/>
         </w:rPr>
-        <w:t>Finalmente, cuando la red se internacionaliza aparece un tercer sujeto. Un operador adquiere los derechos sobre un territorio completo y otorga franquicias dentro de él. No es el titular originario de la marca, pero frente a esos franquiciados asume sus funciones.</w:t>
+        <w:t>Y cuando la red sale al exterior aparece un tercero. Alguien compra los derechos de un país entero y después otorga franquicias ahí adentro. No es el dueño de la marca, pero para esos locales hace de dueño.</w:t>
       </w:r>
     </w:p>
     <w:p>
@@ -1501,7 +1512,7 @@
           <w:color w:val="A8532B"/>
           <w:sz w:val="19"/>
         </w:rPr>
-        <w:t>10:35 – 12:37</w:t>
+        <w:t>10:54 – 12:51</w:t>
       </w:r>
     </w:p>
     <w:p>
@@ -1538,7 +1549,7 @@
           <w:color w:val="1B2A41"/>
           <w:sz w:val="25"/>
         </w:rPr>
-        <w:t>En la diapositiva están los doce puntos; no voy a leerlos. Prefiero detenerme en la lógica que los ordena, porque ambas columnas describen la misma decisión desde lados opuestos.</w:t>
+        <w:t>En la diapositiva están los doce puntos; no los voy a leer. Prefiero explicarles la lógica, porque las dos columnas son la misma decisión vista de los dos lados.</w:t>
       </w:r>
     </w:p>
     <w:p>
@@ -1549,7 +1560,7 @@
           <w:color w:val="1B2A41"/>
           <w:sz w:val="25"/>
         </w:rPr>
-        <w:t>Lo que se obtiene se reduce a dos cosas. La primera es tiempo: no se invierte en averiguar qué funciona, se ingresa a un modelo ya validado. De ahí que las franquicias registren tasas de supervivencia superiores a las de negocios independientes comparables; no es un efecto del azar, es que los errores costosos ya fueron asumidos por otro. La segunda es escala: publicidad, capacitación y compras se ejecutan para la red completa. Un establecimiento independiente negocia cien unidades; la red negocia cien mil. No obtienen el mismo precio ni las mismas condiciones de pago.</w:t>
+        <w:t>Lo que se gana son dos cosas. Tiempo: uno no se pone a averiguar qué funciona, entra a algo que ya funciona. Por eso las franquicias sobreviven más que los negocios independientes parecidos; no es suerte, es que los errores caros ya los pagó otro. Y escala: la publicidad, la capacitación y las compras se hacen para toda la red. Un local solo negocia cien unidades, la red negocia cien mil. No les dan el mismo precio ni el mismo plazo de pago.</w:t>
       </w:r>
     </w:p>
     <w:p>
@@ -1560,7 +1571,7 @@
           <w:color w:val="1B2A41"/>
           <w:sz w:val="25"/>
         </w:rPr>
-        <w:t xml:space="preserve">Lo que se cede son también dos cosas. Se cede margen, y en una modalidad que merece precisión: las regalías se calculan sobre </w:t>
+        <w:t xml:space="preserve">Lo que se cede son también dos cosas. Se cede margen, y de una forma que hay que entender bien: las regalías se calculan sobre </w:t>
       </w:r>
       <w:r>
         <w:rPr>
@@ -1569,7 +1580,7 @@
           <w:color w:val="1B2A41"/>
           <w:sz w:val="25"/>
         </w:rPr>
-        <w:t>las ventas, no sobre la utilidad</w:t>
+        <w:t>las ventas, no sobre la ganancia</w:t>
       </w:r>
       <w:r>
         <w:rPr>
@@ -1578,7 +1589,7 @@
           <w:color w:val="1B2A41"/>
           <w:sz w:val="25"/>
         </w:rPr>
-        <w:t>. Si en un mes las ventas caen a la mitad, la regalía se liquida igual. Un mes adverso para el establecimiento no es un mes adverso para la marca.</w:t>
+        <w:t>. Si un mes las ventas caen a la mitad, la regalía se paga igual. Un mes malo para el local no es un mes malo para la marca.</w:t>
       </w:r>
     </w:p>
     <w:p>
@@ -1589,7 +1600,7 @@
           <w:color w:val="1B2A41"/>
           <w:sz w:val="25"/>
         </w:rPr>
-        <w:t>Y se cede autonomía. El franquiciado puede identificar una oportunidad válida en su mercado y no poder implementarla porque el manual no lo autoriza. Existe además una exposición que no controla en absoluto: si la marca sufre un deterioro reputacional, incluso por hechos ocurridos en otro país, su establecimiento pierde afluencia esa semana. Su gestión pudo ser impecable y el costo lo asume igual.</w:t>
+        <w:t>Y se cede autonomía. El franquiciado puede ver una oportunidad real en su mercado y no poder aprovecharla porque el manual no lo permite. Y hay una exposición que no controla en absoluto: si la marca se golpea en su reputación, aunque sea por algo que pasó en otro país, su local pierde clientes esa semana. Pudo haber trabajado impecable y el costo lo asume igual.</w:t>
       </w:r>
     </w:p>
     <w:p>
@@ -1600,7 +1611,7 @@
           <w:color w:val="1B2A41"/>
           <w:sz w:val="25"/>
         </w:rPr>
-        <w:t>Y ahí está el núcleo del asunto: aquello que genera el valor de la red es lo mismo que restringe al franquiciado. No hay uno sin el otro. El contrato únicamente determina en qué punto se traza esa línea.</w:t>
+        <w:t>Ahí está el fondo del asunto: lo mismo que le da valor a la red es lo que le quita libertad al franquiciado. No hay uno sin el otro. El contrato solo define dónde se pone esa raya.</w:t>
       </w:r>
     </w:p>
     <w:p>
@@ -1618,7 +1629,7 @@
           <w:color w:val="A8532B"/>
           <w:sz w:val="19"/>
         </w:rPr>
-        <w:t>12:37 – 14:59</w:t>
+        <w:t>12:51 – 15:03</w:t>
       </w:r>
     </w:p>
     <w:p>
@@ -1675,7 +1686,7 @@
           <w:color w:val="1B2A41"/>
           <w:sz w:val="25"/>
         </w:rPr>
-        <w:t xml:space="preserve"> el modelo funciona porque ninguna de las partes podría sola. Una dispone de la marca, el método y la experiencia acumulada, pero no del capital ni del conocimiento de cada mercado. La otra dispone del capital y del mercado, pero no de la marca ni del método. La franquicia existe para articular esas dos mitades.</w:t>
+        <w:t xml:space="preserve"> esto funciona porque ninguna de las dos partes podría sola. Una tiene la marca, el método y la experiencia, pero no el capital ni el conocimiento de cada mercado. La otra tiene el capital y el mercado, pero no la marca ni el método. La franquicia existe para juntar esas dos mitades.</w:t>
       </w:r>
     </w:p>
     <w:p>
@@ -1695,7 +1706,7 @@
           <w:color w:val="1B2A41"/>
           <w:sz w:val="25"/>
         </w:rPr>
-        <w:t xml:space="preserve"> y es la que más me llamó la atención de la investigación: el grado de exposición de las partes depende de la jurisdicción. Donde la figura está regulada existe un estándar mínimo de protección. Donde no lo está, como en Colombia o en Perú, ese estándar lo fija el contrato o no lo fija nadie. Un contrato deficiente en esas jurisdicciones no es un problema de técnica jurídica: es la ausencia de defensa.</w:t>
+        <w:t xml:space="preserve"> y es la que más me llamó la atención al investigar: qué tan expuestas están las partes depende del país. Donde la ley regula la figura hay un mínimo garantizado. Donde no, como en Colombia o Perú, ese mínimo lo pone el contrato o no lo pone nadie. Un contrato mal hecho ahí no es un problema de forma: es quedarse sin defensa.</w:t>
       </w:r>
     </w:p>
     <w:p>
@@ -1715,7 +1726,7 @@
           <w:color w:val="1B2A41"/>
           <w:sz w:val="25"/>
         </w:rPr>
-        <w:t xml:space="preserve"> la independencia entre las partes es efectiva, pero admite un límite. Se sostiene mientras el franquiciador oriente la operación. Cuando el control alcanza tal intensidad que sustituye la decisión del franquiciado, esa independencia deja de ser real, y así lo han reconocido los tribunales.</w:t>
+        <w:t xml:space="preserve"> la independencia entre las partes es real, pero tiene un límite. Se sostiene mientras la marca oriente. Cuando el control es tan fuerte que reemplaza la decisión del franquiciado, esa independencia deja de existir, y los tribunales ya lo reconocieron.</w:t>
       </w:r>
     </w:p>
     <w:p>
@@ -1726,7 +1737,7 @@
           <w:color w:val="1B2A41"/>
           <w:sz w:val="25"/>
         </w:rPr>
-        <w:t xml:space="preserve">Todo lo anterior es análisis normativo y doctrinal. Para contrastarlo con la práctica, entrevistamos a </w:t>
+        <w:t xml:space="preserve">Todo esto es teoría. Para contrastarlo con la práctica entrevistamos a </w:t>
       </w:r>
       <w:r>
         <w:rPr>
@@ -1744,7 +1755,7 @@
           <w:color w:val="1B2A41"/>
           <w:sz w:val="25"/>
         </w:rPr>
-        <w:t>, vicepresidente de operaciones de Grupo David, con veinte años en la organización y responsabilidad sobre más de cuarenta franquicias.</w:t>
+        <w:t>, vicepresidente de operaciones de Grupo David. Lleva veinte años ahí y hoy responde por más de cuarenta franquicias.</w:t>
       </w:r>
     </w:p>
     <w:p>
@@ -1755,7 +1766,7 @@
           <w:color w:val="1B2A41"/>
           <w:sz w:val="25"/>
         </w:rPr>
-        <w:t xml:space="preserve">Antes de la proyección, dos términos que él emplea. </w:t>
+        <w:t xml:space="preserve">Antes de verlo, dos términos que él usa. </w:t>
       </w:r>
       <w:r>
         <w:rPr>
@@ -1773,7 +1784,7 @@
           <w:color w:val="1B2A41"/>
           <w:sz w:val="25"/>
         </w:rPr>
-        <w:t xml:space="preserve"> es el nivel de reconocimiento y preferencia de marca en un mercado determinado; para él es el factor que define si una apertura procede o no procede. Y </w:t>
+        <w:t xml:space="preserve"> es qué tanto una marca es conocida y deseada en un mercado; para él eso define si se abre o no se abre un local. Y </w:t>
       </w:r>
       <w:r>
         <w:rPr>
@@ -1791,7 +1802,7 @@
           <w:color w:val="1B2A41"/>
           <w:sz w:val="25"/>
         </w:rPr>
-        <w:t xml:space="preserve"> es la adaptación del producto al mercado local: ajuste de materiales, colores y surtido según clima y hábitos de consumo. Su ejemplo es ilustrativo: enviar ropa de invierno a una ciudad cálida equivale a perder la temporada completa.</w:t>
+        <w:t xml:space="preserve"> es adaptar el producto a cada mercado: cambiar telas, colores y surtido según el clima y lo que la gente usa. Su ejemplo lo resume bien: mandar ropa de invierno a una ciudad cálida es perder la temporada entera.</w:t>
       </w:r>
     </w:p>
     <w:p>
@@ -1802,7 +1813,7 @@
           <w:color w:val="1B2A41"/>
           <w:sz w:val="25"/>
         </w:rPr>
-        <w:t>Presten atención especialmente a un punto: hasta dónde puede adaptarse el modelo sin comprometer el estándar. Lo que aquí se plantea en términos abstractos, para él constituye una decisión operativa cotidiana.</w:t>
+        <w:t>Presten atención sobre todo a una cosa: hasta dónde se puede adaptar el modelo sin romper el estándar. Lo que acá suena abstracto, para él es una decisión de todos los días.</w:t>
       </w:r>
     </w:p>
     <w:p>
@@ -1868,7 +1879,7 @@
           <w:color w:val="1B2A41"/>
           <w:sz w:val="25"/>
         </w:rPr>
-        <w:t>La entrevista confirma algo que en el análisis apenas se intuye: lo que sostiene una franquicia no es el texto del contrato, sino el rigor con que se replica el estándar y el criterio con que se adapta a cada mercado. Con gusto respondo sus preguntas.</w:t>
+        <w:t>La entrevista deja clara una cosa que en el análisis apenas se asoma: lo que sostiene una franquicia no es el texto del contrato, sino el rigor con que se repite el estándar y el criterio con que se adapta a cada mercado. Con gusto respondo sus preguntas.</w:t>
       </w:r>
     </w:p>
     <w:p>
@@ -1894,7 +1905,7 @@
           <w:color w:val="1B2A41"/>
           <w:sz w:val="23"/>
         </w:rPr>
-        <w:t>¿Cuál es el monto de una franquicia?</w:t>
+        <w:t>¿Cuánto cuesta una franquicia?</w:t>
       </w:r>
     </w:p>
     <w:p>
@@ -1906,7 +1917,7 @@
           <w:color w:val="445570"/>
           <w:sz w:val="23"/>
         </w:rPr>
-        <w:t>Depende del sector y del posicionamiento de la marca, pero la estructura es siempre la misma: un canon de entrada, único y al inicio, y regalías periódicas calculadas normalmente como porcentaje de las ventas.</w:t>
+        <w:t>Depende del sector y de qué tan fuerte sea la marca, pero la estructura es siempre la misma: un canon de entrada, que es único y al principio, y regalías mensuales, que normalmente son un porcentaje de las ventas.</w:t>
       </w:r>
     </w:p>
     <w:p>
@@ -1919,7 +1930,7 @@
           <w:color w:val="1B2A41"/>
           <w:sz w:val="23"/>
         </w:rPr>
-        <w:t>¿Puede el franquiciado transferir su establecimiento?</w:t>
+        <w:t>¿El franquiciado puede vender su local?</w:t>
       </w:r>
     </w:p>
     <w:p>
@@ -1931,7 +1942,7 @@
           <w:color w:val="445570"/>
           <w:sz w:val="23"/>
         </w:rPr>
-        <w:t>Solo con autorización del franquiciador, y así suele quedar pactado. La marca conserva la facultad de decidir quién se incorpora a su red.</w:t>
+        <w:t>Solo con autorización de la marca, y así queda escrito casi siempre. La marca quiere decidir quién entra a su red.</w:t>
       </w:r>
     </w:p>
     <w:p>
@@ -1944,7 +1955,7 @@
           <w:color w:val="1B2A41"/>
           <w:sz w:val="23"/>
         </w:rPr>
-        <w:t>¿Quién responde frente a un daño sufrido por un cliente en el local?</w:t>
+        <w:t>¿Quién responde si un cliente se lastima en el local?</w:t>
       </w:r>
     </w:p>
     <w:p>
@@ -1956,7 +1967,7 @@
           <w:color w:val="445570"/>
           <w:sz w:val="23"/>
         </w:rPr>
-        <w:t>Por regla general el franquiciado, por su condición de empresario independiente. Los tribunales españoles han responsabilizado al franquiciador cuando se acredita que el daño derivó de una instrucción concreta que él impuso. La existencia de estándares de calidad no basta: debe probarse el nexo causal.</w:t>
+        <w:t>En principio el franquiciado, porque es un empresario independiente. Los tribunales españoles han responsabilizado a la marca cuando se prueba que el daño vino de una instrucción concreta que ella dio. Tener estándares de calidad no basta: hay que probar que esa orden causó el daño.</w:t>
       </w:r>
     </w:p>
     <w:p>
@@ -1969,7 +1980,7 @@
           <w:color w:val="1B2A41"/>
           <w:sz w:val="23"/>
         </w:rPr>
-        <w:t>¿Qué margen tiene el franquiciado para modificar la operación?</w:t>
+        <w:t>¿Cuánto margen tiene el franquiciado para cambiar cosas?</w:t>
       </w:r>
     </w:p>
     <w:p>
@@ -1981,7 +1992,7 @@
           <w:color w:val="445570"/>
           <w:sz w:val="23"/>
         </w:rPr>
-        <w:t>Requiere autorización. Un laudo arbitral colombiano, el caso PANACA, precisó que el franquiciado debe respetar la filosofía de la marca, pero que los manuales tampoco pueden aplicarse de forma idéntica en cualquier plaza o mercado.</w:t>
+        <w:t>Necesita autorización. Un laudo arbitral colombiano, el caso PANACA, dejó dicho que el franquiciado debe respetar la filosofía de la marca, pero que los manuales tampoco se pueden aplicar igual en cualquier ciudad.</w:t>
       </w:r>
     </w:p>
     <w:p>
@@ -2006,7 +2017,7 @@
           <w:color w:val="445570"/>
           <w:sz w:val="23"/>
         </w:rPr>
-        <w:t>La licencia autoriza únicamente el uso del signo distintivo. La franquicia transfiere además el know-how, los manuales, la capacitación y la asistencia continua, y viene acompañada de facultades de control sobre la operación.</w:t>
+        <w:t>La licencia solo autoriza usar el nombre. La franquicia entrega además el know-how, los manuales, la capacitación y la asistencia continua, y viene con control sobre cómo se opera.</w:t>
       </w:r>
     </w:p>
     <w:p>
@@ -2019,7 +2030,7 @@
           <w:color w:val="1B2A41"/>
           <w:sz w:val="23"/>
         </w:rPr>
-        <w:t>¿Por qué Colombia no ha regulado la figura pese a su difusión?</w:t>
+        <w:t>¿Por qué Colombia no lo ha regulado si es tan común?</w:t>
       </w:r>
     </w:p>
     <w:p>
@@ -2031,7 +2042,7 @@
           <w:color w:val="445570"/>
           <w:sz w:val="23"/>
         </w:rPr>
-        <w:t>Existe una norma técnica de aplicación voluntaria, la NTC 5813, y el Ministerio de Comercio redactó en 2021 un proyecto de decreto que contemplaba ese plazo de veinte días hábiles. A la fecha de nuestra revisión, el proyecto seguía sin expedirse.</w:t>
+        <w:t>Hay una norma técnica voluntaria, la NTC 5813, y el Ministerio de Comercio redactó en 2021 un proyecto de decreto que incluía ese plazo de veinte días. Cuando hicimos la revisión seguía sin expedirse.</w:t>
       </w:r>
     </w:p>
     <w:p>
@@ -2044,7 +2055,7 @@
           <w:color w:val="1B2A41"/>
           <w:sz w:val="23"/>
         </w:rPr>
-        <w:t>¿Cuál es la duración habitual del contrato?</w:t>
+        <w:t>¿Cuánto dura normalmente el contrato?</w:t>
       </w:r>
     </w:p>
     <w:p>
@@ -2056,7 +2067,7 @@
           <w:color w:val="445570"/>
           <w:sz w:val="23"/>
         </w:rPr>
-        <w:t>La fija el contrato y varía según el sector, pero siempre incorpora cláusulas de renovación y de terminación. Se trata de una relación de larga duración, y por eso la salida se negocia desde el inicio.</w:t>
+        <w:t>Lo fija el contrato y cambia según el sector, pero siempre trae cláusulas de renovación y de terminación. Es una relación de largo plazo, y por eso la salida se negocia desde el principio.</w:t>
       </w:r>
     </w:p>
     <w:sectPr>

</xml_diff>

<commit_message>
Reescribir el guion para que fluya al leerlo en voz alta
El problema de fondo era que el texto estaba construido con dos puntos,
que no se pronuncian, y con frases yuxtapuestas sin nexo. Al leerlo en voz
alta el discurso se cortaba en cada salto.

Se elimina todo dos puntos, punto y coma y guion largo del texto hablado,
y las ideas se enlazan con conectores explícitos, de modo que cada párrafo
arranca ligado al anterior. El ejemplo que se señaló, «se topa con el mismo
límite: abrir puntos nuevos cuesta capital, y el propio alcanza hasta
cierto punto», queda como «se topa tarde o temprano con el mismo problema,
y es que abrir locales nuevos cuesta dinero, mientras que el dinero propio
siempre alcanza hasta cierto punto, así que lo habitual es endeudarse o
crecer más despacio».

El texto se separa a deck/guion_texto.py y el generador verifica en cada
compilación que no haya dos puntos y que ningún párrafo abra sin conector,
así que la regla no se puede volver a romper sin que salte.
</commit_message>
<xml_diff>
--- a/Guion exposicion - Contrato de franquicia.docx
+++ b/Guion exposicion - Contrato de franquicia.docx
@@ -50,7 +50,7 @@
           <w:color w:val="707886"/>
           <w:sz w:val="22"/>
         </w:rPr>
-        <w:t>El video de la entrevista se proyecta después de los quince minutos, así que estos quince son todos de exposición. La diapositiva 6 la cierra y deja el video montado. Leído a ritmo normal, unas 140 palabras por minuto, el guion completo da 15:03.</w:t>
+        <w:t>El video de la entrevista se proyecta después de los quince minutos, así que estos quince son todos de exposición. La diapositiva 6 la cierra y deja el video montado. Leído a ritmo normal, unas 140 palabras por minuto, el guion completo da 15:17.</w:t>
       </w:r>
     </w:p>
     <w:tbl>
@@ -195,7 +195,7 @@
                 <w:color w:val="1B2A41"/>
                 <w:sz w:val="20"/>
               </w:rPr>
-              <w:t>1:11</w:t>
+              <w:t>1:15</w:t>
             </w:r>
           </w:p>
         </w:tc>
@@ -221,7 +221,7 @@
                 <w:color w:val="1B2A41"/>
                 <w:sz w:val="20"/>
               </w:rPr>
-              <w:t>1:11</w:t>
+              <w:t>1:15</w:t>
             </w:r>
           </w:p>
         </w:tc>
@@ -269,7 +269,7 @@
                 <w:color w:val="1B2A41"/>
                 <w:sz w:val="20"/>
               </w:rPr>
-              <w:t>3:37</w:t>
+              <w:t>3:28</w:t>
             </w:r>
           </w:p>
         </w:tc>
@@ -295,7 +295,7 @@
                 <w:color w:val="1B2A41"/>
                 <w:sz w:val="20"/>
               </w:rPr>
-              <w:t>4:49</w:t>
+              <w:t>4:43</w:t>
             </w:r>
           </w:p>
         </w:tc>
@@ -343,7 +343,7 @@
                 <w:color w:val="1B2A41"/>
                 <w:sz w:val="20"/>
               </w:rPr>
-              <w:t>2:47</w:t>
+              <w:t>2:54</w:t>
             </w:r>
           </w:p>
         </w:tc>
@@ -369,7 +369,7 @@
                 <w:color w:val="1B2A41"/>
                 <w:sz w:val="20"/>
               </w:rPr>
-              <w:t>7:36</w:t>
+              <w:t>7:37</w:t>
             </w:r>
           </w:p>
         </w:tc>
@@ -417,7 +417,7 @@
                 <w:color w:val="1B2A41"/>
                 <w:sz w:val="20"/>
               </w:rPr>
-              <w:t>3:17</w:t>
+              <w:t>3:10</w:t>
             </w:r>
           </w:p>
         </w:tc>
@@ -443,7 +443,7 @@
                 <w:color w:val="1B2A41"/>
                 <w:sz w:val="20"/>
               </w:rPr>
-              <w:t>10:54</w:t>
+              <w:t>10:47</w:t>
             </w:r>
           </w:p>
         </w:tc>
@@ -491,7 +491,7 @@
                 <w:color w:val="1B2A41"/>
                 <w:sz w:val="20"/>
               </w:rPr>
-              <w:t>1:57</w:t>
+              <w:t>2:09</w:t>
             </w:r>
           </w:p>
         </w:tc>
@@ -517,7 +517,7 @@
                 <w:color w:val="1B2A41"/>
                 <w:sz w:val="20"/>
               </w:rPr>
-              <w:t>12:51</w:t>
+              <w:t>12:57</w:t>
             </w:r>
           </w:p>
         </w:tc>
@@ -565,7 +565,7 @@
                 <w:color w:val="1B2A41"/>
                 <w:sz w:val="20"/>
               </w:rPr>
-              <w:t>2:12</w:t>
+              <w:t>2:20</w:t>
             </w:r>
           </w:p>
         </w:tc>
@@ -592,7 +592,7 @@
                 <w:color w:val="A8532B"/>
                 <w:sz w:val="20"/>
               </w:rPr>
-              <w:t>15:03</w:t>
+              <w:t>15:17</w:t>
             </w:r>
           </w:p>
         </w:tc>
@@ -714,7 +714,7 @@
           <w:color w:val="A8532B"/>
           <w:sz w:val="19"/>
         </w:rPr>
-        <w:t>0:00 – 1:11</w:t>
+        <w:t>0:00 – 1:15</w:t>
       </w:r>
     </w:p>
     <w:p>
@@ -780,7 +780,7 @@
           <w:color w:val="1B2A41"/>
           <w:sz w:val="25"/>
         </w:rPr>
-        <w:t>Cualquier empresa que quiere crecer se topa con el mismo límite: abrir puntos nuevos cuesta capital, y el propio alcanza hasta cierto punto. Las salidas de siempre son endeudarse o crecer más lento.</w:t>
+        <w:t>Cualquier empresa que quiere crecer se topa tarde o temprano con el mismo problema, y es que abrir locales nuevos cuesta dinero, mientras que el dinero propio siempre alcanza hasta cierto punto, así que lo habitual es endeudarse o crecer más despacio.</w:t>
       </w:r>
     </w:p>
     <w:p>
@@ -791,7 +791,7 @@
           <w:color w:val="1B2A41"/>
           <w:sz w:val="25"/>
         </w:rPr>
-        <w:t>La franquicia propone otra: crecer con el dinero de otros. Alguien más pone la inversión, abre el local y lo opera bajo tu marca.</w:t>
+        <w:t>Y la franquicia aparece como una tercera salida, porque permite crecer con el dinero de otros. Alguien más pone la inversión y opera el local bajo tu marca, de manera que la red se expande sin que el dueño de la marca tenga que financiarla.</w:t>
       </w:r>
     </w:p>
     <w:p>
@@ -802,7 +802,7 @@
           <w:color w:val="1B2A41"/>
           <w:sz w:val="25"/>
         </w:rPr>
-        <w:t>Suena cómodo, pero tiene un precio alto. Para que funcione hay que entregarle a un tercero lo único que de verdad vale en la empresa: el nombre y la forma de trabajar. Y después confiar en que lo va a hacer igual de bien en una ciudad donde uno no está para vigilarlo.</w:t>
+        <w:t>Eso tiene un precio alto, porque hay que entregarle a un tercero lo único que sostiene el valor de la empresa, que es su nombre y su forma de trabajar, y confiar en que lo hará igual de bien en una ciudad donde uno no está para vigilarlo.</w:t>
       </w:r>
     </w:p>
     <w:p>
@@ -813,7 +813,7 @@
           <w:color w:val="1B2A41"/>
           <w:sz w:val="25"/>
         </w:rPr>
-        <w:t>El contrato de franquicia es lo que vuelve manejable ese riesgo. Ahí queda definido qué se entrega, qué se cobra, qué se controla y qué pasa cuando la relación se rompe. Eso es lo que voy a explicar en estos quince minutos.</w:t>
+        <w:t>Justamente por eso existe el contrato, porque es lo que vuelve manejable ese riesgo, y es lo que voy a explicarles en estos quince minutos.</w:t>
       </w:r>
     </w:p>
     <w:p>
@@ -831,7 +831,7 @@
           <w:color w:val="A8532B"/>
           <w:sz w:val="19"/>
         </w:rPr>
-        <w:t>1:11 – 4:49</w:t>
+        <w:t>1:15 – 4:43</w:t>
       </w:r>
     </w:p>
     <w:p>
@@ -868,7 +868,7 @@
           <w:color w:val="1B2A41"/>
           <w:sz w:val="25"/>
         </w:rPr>
-        <w:t>Cuando una empresa franquicia, no está vendiendo un producto. Está vendiendo la capacidad de repetir su negocio. Y eso son tres cosas distintas.</w:t>
+        <w:t>Cuando una empresa franquicia, lo que vende no es un producto sino la capacidad de repetir su negocio, y eso se compone de tres cosas distintas.</w:t>
       </w:r>
     </w:p>
     <w:p>
@@ -879,7 +879,7 @@
           <w:color w:val="1B2A41"/>
           <w:sz w:val="25"/>
         </w:rPr>
-        <w:t>La primera es la marca, y sirve para algo muy concreto: el local nuevo se ahorra los años que cuesta que la gente confíe en un nombre. El cliente entra sabiendo qué va a encontrar.</w:t>
+        <w:t>La primera y más evidente es la marca, que le ahorra al local nuevo todos los años que cuesta lograr que la gente confíe en un nombre, porque el cliente entra ya sabiendo qué va a encontrar.</w:t>
       </w:r>
     </w:p>
     <w:p>
@@ -890,7 +890,7 @@
           <w:color w:val="1B2A41"/>
           <w:sz w:val="25"/>
         </w:rPr>
-        <w:t xml:space="preserve">La segunda es el </w:t>
+        <w:t xml:space="preserve">Después viene el </w:t>
       </w:r>
       <w:r>
         <w:rPr>
@@ -908,7 +908,7 @@
           <w:color w:val="1B2A41"/>
           <w:sz w:val="25"/>
         </w:rPr>
-        <w:t>, y ahí está el valor de verdad. Es un término del inglés que significa saber hacer. Son todos los procedimientos que la empresa fue afinando con los años: cómo se prepara cada producto, cuánta gente hace falta en cada turno, qué se hace cuando un cliente reclama, cómo se maneja el inventario. Nada de eso se puede patentar, porque no es un invento: es experiencia, y buena parte se aprendió cometiendo errores caros. Al franquiciar, todo eso se pone por escrito en manuales y se le entrega a alguien de afuera. Por eso las cláusulas de confidencialidad son tan duras: el franquiciado lo puede usar, pero no lo puede contar, y esa obligación le sigue aunque el contrato termine.</w:t>
+        <w:t>, y ahí está el valor de verdad. Es un término del inglés que significa saber hacer, y se refiere a los procedimientos que la empresa fue afinando con los años, desde cómo se prepara cada producto hasta cuánta gente hace falta en cada turno. Nada de eso se puede patentar, porque no es un invento sino experiencia acumulada a base de errores caros. Cuando la empresa franquicia, todo eso se pone por escrito y se le entrega a alguien de afuera, y por eso las cláusulas de confidencialidad son tan duras, ya que el franquiciado lo puede usar pero no divulgar, incluso después de que el contrato termine.</w:t>
       </w:r>
     </w:p>
     <w:p>
@@ -919,7 +919,7 @@
           <w:color w:val="1B2A41"/>
           <w:sz w:val="25"/>
         </w:rPr>
-        <w:t>La tercera es la forma de operar: cómo se ve el local, cómo se atiende, cómo se hace la publicidad. No es un tema de gusto. Es lo que permite que dos locales con dueños distintos le resulten iguales al cliente.</w:t>
+        <w:t>Y por último está la forma de operar, es decir cómo se ve el local, cómo se atiende y cómo se hace la publicidad, que es lo que logra que dos locales con dueños distintos le resulten iguales al cliente. Las tres cosas juntas son la franquicia.</w:t>
       </w:r>
     </w:p>
     <w:p>
@@ -930,7 +930,7 @@
           <w:color w:val="1B2A41"/>
           <w:sz w:val="25"/>
         </w:rPr>
-        <w:t>Esas tres cosas juntas son la franquicia.</w:t>
+        <w:t>El contrato, en cambio, es el documento donde queda fijado cuánto se paga, por cuánto tiempo, en qué zona se opera y qué pasa si alguien incumple, y tiene dos rasgos particulares.</w:t>
       </w:r>
     </w:p>
     <w:p>
@@ -941,7 +941,7 @@
           <w:color w:val="1B2A41"/>
           <w:sz w:val="25"/>
         </w:rPr>
-        <w:t>El contrato es otra cosa. Es el documento donde se fija cuánto se paga, por cuánto tiempo, en qué zona, qué puede hacer cada uno y qué pasa si alguien incumple. Y tiene dos rasgos que lo diferencian de un contrato comercial común.</w:t>
+        <w:t>El primero es que no se cumple y se termina. En una compraventa uno paga, el otro entrega y ahí queda cerrada la relación, mientras que acá sigue viva con pagos cada mes, asistencia y supervisión, así que se parece más a un arriendo que a una compra.</w:t>
       </w:r>
     </w:p>
     <w:p>
@@ -952,18 +952,7 @@
           <w:color w:val="1B2A41"/>
           <w:sz w:val="25"/>
         </w:rPr>
-        <w:t>El primero: no se cumple y se termina. En una compraventa uno paga, el otro entrega y ahí queda. Acá la relación sigue viva todo el tiempo que dure: hay pagos cada mes, asistencia permanente y supervisión constante. Se parece más a un arriendo que a una compra.</w:t>
-      </w:r>
-    </w:p>
-    <w:p>
-      <w:r>
-        <w:rPr>
-          <w:rFonts w:ascii="Calibri" w:hAnsi="Calibri"/>
-          <w:b w:val="0"/>
-          <w:color w:val="1B2A41"/>
-          <w:sz w:val="25"/>
-        </w:rPr>
-        <w:t xml:space="preserve">El segundo es menos evidente: el contrato está </w:t>
+        <w:t xml:space="preserve">El segundo es menos evidente, y es que el contrato está </w:t>
       </w:r>
       <w:r>
         <w:rPr>
@@ -981,7 +970,7 @@
           <w:color w:val="1B2A41"/>
           <w:sz w:val="25"/>
         </w:rPr>
-        <w:t>. Ninguno prevé que en ocho años la gente compre de otra manera, ni que aparezca una pandemia. Y no es que el abogado lo haya hecho mal. Un contrato que amarre todas las variables le impide a la red moverse cuando el mercado se mueve. Ese margen es lo que le da capacidad de adaptarse.</w:t>
+        <w:t>. Ninguno alcanza a prever que en ocho años la gente compre de otra manera, pero eso no significa que el abogado lo haya redactado mal, porque si amarrara todas las variables la red no podría moverse cuando el mercado se mueve.</w:t>
       </w:r>
     </w:p>
     <w:p>
@@ -992,7 +981,7 @@
           <w:color w:val="1B2A41"/>
           <w:sz w:val="25"/>
         </w:rPr>
-        <w:t xml:space="preserve">Hay algo más: es un </w:t>
+        <w:t xml:space="preserve">A esto hay que sumarle que es un </w:t>
       </w:r>
       <w:r>
         <w:rPr>
@@ -1010,7 +999,7 @@
           <w:color w:val="1B2A41"/>
           <w:sz w:val="25"/>
         </w:rPr>
-        <w:t>. No regula una operación puntual, regula la entrada a una red. Por eso las obligaciones del franquiciado no salen solo del texto que firmó; también salen de operar el negocio todos los días según ese método.</w:t>
+        <w:t>, porque no regula una operación puntual sino la entrada a una red, así que las obligaciones no salen solo del texto que firmó sino también de operar el negocio según ese método.</w:t>
       </w:r>
     </w:p>
     <w:p>
@@ -1021,7 +1010,7 @@
           <w:color w:val="1B2A41"/>
           <w:sz w:val="25"/>
         </w:rPr>
-        <w:t xml:space="preserve">Y una advertencia que cambia según el país. </w:t>
+        <w:t xml:space="preserve">Y hay una advertencia final que cambia según el país. </w:t>
       </w:r>
       <w:r>
         <w:rPr>
@@ -1039,7 +1028,7 @@
           <w:color w:val="1B2A41"/>
           <w:sz w:val="25"/>
         </w:rPr>
-        <w:t xml:space="preserve"> metió la franquicia en su Código Civil y Comercial: si hay un pleito, hay artículos que aplicar. </w:t>
+        <w:t xml:space="preserve"> incorporó la franquicia a su Código Civil y Comercial, así que si hay un pleito existen artículos que aplicar, y </w:t>
       </w:r>
       <w:r>
         <w:rPr>
@@ -1075,7 +1064,7 @@
           <w:color w:val="1B2A41"/>
           <w:sz w:val="25"/>
         </w:rPr>
-        <w:t xml:space="preserve"> la tratan como contrato atípico, o sea que la ley no la menciona. No es ilegal, pero implica que lo que el contrato no diga, no lo dice nadie. Ahí el contrato no respalda el acuerdo: el contrato es el acuerdo.</w:t>
+        <w:t>, en cambio, la tratan como contrato atípico, o sea que la ley no la menciona, y eso implica que todo lo que el contrato no diga no lo dice nadie, de manera que ahí el contrato no respalda el acuerdo sino que es el acuerdo.</w:t>
       </w:r>
     </w:p>
     <w:p>
@@ -1093,7 +1082,7 @@
           <w:color w:val="A8532B"/>
           <w:sz w:val="19"/>
         </w:rPr>
-        <w:t>4:49 – 7:36</w:t>
+        <w:t>4:43 – 7:37</w:t>
       </w:r>
     </w:p>
     <w:p>
@@ -1130,7 +1119,7 @@
           <w:color w:val="1B2A41"/>
           <w:sz w:val="25"/>
         </w:rPr>
-        <w:t>El proceso tiene cinco etapas, y la primera no es firmar: es elegir.</w:t>
+        <w:t>Veamos entonces cómo funciona esto en la práctica, porque el proceso tiene cinco etapas y la primera no es firmar sino elegir.</w:t>
       </w:r>
     </w:p>
     <w:p>
@@ -1141,7 +1130,7 @@
           <w:color w:val="1B2A41"/>
           <w:sz w:val="25"/>
         </w:rPr>
-        <w:t>La marca no le da una franquicia a cualquiera que tenga el dinero. Evalúa candidatos, y los evalúa con cuidado, porque cada local que abre lleva su nombre en la fachada. Los estudios coinciden en que elegir bien al franquiciado es una de las decisiones que más determina si la red funciona. Y el riesgo no se reparte igual: si opera mal, él pierde su inversión, pero la marca pierde prestigio en todo el mercado.</w:t>
+        <w:t>La marca no le entrega una franquicia a cualquiera que tenga el dinero, sino que evalúa candidatos con cuidado, porque cada local que abre va a llevar su nombre en la fachada. De hecho, los estudios coinciden en que es una de las decisiones que más determina si la red funciona, porque el riesgo no se reparte por igual, ya que si el franquiciado opera mal él pierde su inversión pero la marca pierde prestigio en todo el mercado.</w:t>
       </w:r>
     </w:p>
     <w:p>
@@ -1152,7 +1141,7 @@
           <w:color w:val="1B2A41"/>
           <w:sz w:val="25"/>
         </w:rPr>
-        <w:t>Cuando hay acuerdo, se firma. Y ahí no solo se pacta el precio: se pacta la salida. Cuánto dura, cómo se renueva, en qué casos se puede cortar antes y quién decide si hay conflicto. Todo eso se define al principio, mientras las dos partes se están llevando bien, justamente porque después no se van a poner de acuerdo.</w:t>
+        <w:t>Una vez que hay acuerdo se firma, y ahí no solo se pacta el precio sino también la salida, es decir cuánto dura, cómo se renueva y en qué casos se puede cortar antes. Todo eso se define al principio, mientras las dos partes se están llevando bien, porque después va a ser mucho más difícil ponerse de acuerdo.</w:t>
       </w:r>
     </w:p>
     <w:p>
@@ -1163,7 +1152,7 @@
           <w:color w:val="1B2A41"/>
           <w:sz w:val="25"/>
         </w:rPr>
-        <w:t>Después viene la etapa que nadie ve y que es de las más importantes: la capacitación. Se entrena al dueño y al personal, se entregan los manuales, se acompaña la apertura. Ahí es donde el know-how cambia de manos en la práctica.</w:t>
+        <w:t>Luego viene la etapa que nadie ve y que es de las más importantes, que es la capacitación. Se entrena al dueño y al personal, se entregan los manuales y se acompaña la apertura, así que es acá donde el know-how cambia de manos de verdad.</w:t>
       </w:r>
     </w:p>
     <w:p>
@@ -1174,7 +1163,7 @@
           <w:color w:val="1B2A41"/>
           <w:sz w:val="25"/>
         </w:rPr>
-        <w:t>El local abre. Y el franquiciado lleva el negocio completo: contrata, paga la nómina, atiende, responde por el arriendo. Pero lo hace dentro de reglas que no escribió él.</w:t>
+        <w:t>Cuando el local abre, el franquiciado lleva el negocio completo, porque contrata, paga la nómina, atiende y responde por el arriendo, aunque dentro de reglas que no escribió él.</w:t>
       </w:r>
     </w:p>
     <w:p>
@@ -1185,7 +1174,7 @@
           <w:color w:val="1B2A41"/>
           <w:sz w:val="25"/>
         </w:rPr>
-        <w:t>Y la marca no desaparece: vuelve. Visita el local, revisa que se cumplan los estándares, audita las instalaciones y en muchos contratos también los libros contables. Es una facultad incómoda, y está aceptada desde el primer día por una razón práctica: cuando algo sale mal, el cliente no culpa al dueño del local, culpa a la marca. El daño se reparte entre todos los que están en la red.</w:t>
+        <w:t>Y la marca no desaparece después de la firma, sino que vuelve. Visita el local, revisa los estándares y audita las instalaciones y a veces los libros contables. Es incómodo, pero está aceptado desde el primer día porque cuando algo sale mal el cliente no culpa al dueño del local sino a la marca, de modo que el daño se reparte entre toda la red.</w:t>
       </w:r>
     </w:p>
     <w:p>
@@ -1196,7 +1185,7 @@
           <w:color w:val="1B2A41"/>
           <w:sz w:val="25"/>
         </w:rPr>
-        <w:t xml:space="preserve">Hay una obligación anterior a todo esto que para mí es lo más interesante de la figura. Antes de firmar, la marca tiene que entregarle al futuro franquiciado información real del negocio: quién es, cómo está el sector, cómo está armada la red. Y con </w:t>
+        <w:t xml:space="preserve">Ahora, antes de todo este ciclo hay una obligación que para mí es lo más interesante de la figura, y es que la marca tiene que entregarle al futuro franquiciado información real del negocio, o sea quién es, cómo está el sector y cómo está armada la red. Además debe hacerlo con </w:t>
       </w:r>
       <w:r>
         <w:rPr>
@@ -1214,7 +1203,7 @@
           <w:color w:val="1B2A41"/>
           <w:sz w:val="25"/>
         </w:rPr>
-        <w:t xml:space="preserve"> de anticipación, para que decida con todo sobre la mesa. Existe porque la diferencia de información es enorme: el que ofrece conoce el negocio a fondo y el que invierte casi no lo conoce. Y si esa información se esconde o se maquilla, hay responsabilidad por daños </w:t>
+        <w:t xml:space="preserve"> de anticipación, para que alcance a decidir con todo sobre la mesa, y existe porque el que ofrece conoce el negocio a fondo mientras el que invierte casi no lo conoce. Y si esa información se esconde o se maquilla hay responsabilidad por daños </w:t>
       </w:r>
       <w:r>
         <w:rPr>
@@ -1223,7 +1212,7 @@
           <w:color w:val="1B2A41"/>
           <w:sz w:val="25"/>
         </w:rPr>
-        <w:t>aunque el contrato no se llegue a firmar</w:t>
+        <w:t>aunque el contrato no llegue a firmarse</w:t>
       </w:r>
       <w:r>
         <w:rPr>
@@ -1250,7 +1239,7 @@
           <w:color w:val="A8532B"/>
           <w:sz w:val="19"/>
         </w:rPr>
-        <w:t>7:36 – 10:54</w:t>
+        <w:t>7:37 – 10:47</w:t>
       </w:r>
     </w:p>
     <w:p>
@@ -1287,7 +1276,7 @@
           <w:color w:val="1B2A41"/>
           <w:sz w:val="25"/>
         </w:rPr>
-        <w:t xml:space="preserve">Son dos partes, y los nombres se parecen tanto que se confunden. El </w:t>
+        <w:t xml:space="preserve">En esta relación intervienen dos partes, y como los nombres se parecen tanto suelen confundirse. El </w:t>
       </w:r>
       <w:r>
         <w:rPr>
@@ -1305,7 +1294,7 @@
           <w:color w:val="1B2A41"/>
           <w:sz w:val="25"/>
         </w:rPr>
-        <w:t xml:space="preserve">, que también se llama franquiciante u otorgante, es el dueño de la marca. El </w:t>
+        <w:t xml:space="preserve">, que también se llama franquiciante u otorgante, es el dueño de la marca, mientras que el </w:t>
       </w:r>
       <w:r>
         <w:rPr>
@@ -1323,7 +1312,7 @@
           <w:color w:val="1B2A41"/>
           <w:sz w:val="25"/>
         </w:rPr>
-        <w:t>, o franquiciatario, es el que abre y opera el local.</w:t>
+        <w:t>, o franquiciatario, es quien abre y opera el local.</w:t>
       </w:r>
     </w:p>
     <w:p>
@@ -1334,7 +1323,7 @@
           <w:color w:val="1B2A41"/>
           <w:sz w:val="25"/>
         </w:rPr>
-        <w:t>Lo que aporta el dueño de la marca no se puede tocar: el nombre, el know-how, los manuales y la asistencia técnica. Y hay un requisito previo del que casi no se habla: para poder franquiciar tuvo que haber operado su propio negocio con éxito durante un buen tiempo. No se franquicia una idea, se franquicia un historial. Y ese historial define cuánto vale lo que ofrece.</w:t>
+        <w:t>Lo que aporta el dueño de la marca no se puede tocar, porque son el nombre, el know-how, los manuales y la asistencia técnica. Y para franquiciar tuvo que haber operado su propio negocio con éxito durante años, así que no se franquicia una idea sino un historial, y eso es lo que define cuánto vale.</w:t>
       </w:r>
     </w:p>
     <w:p>
@@ -1345,7 +1334,7 @@
           <w:color w:val="1B2A41"/>
           <w:sz w:val="25"/>
         </w:rPr>
-        <w:t xml:space="preserve">Cobra de dos maneras distintas, y no son lo mismo. El </w:t>
+        <w:t xml:space="preserve">A cambio cobra de dos maneras que no son lo mismo. El </w:t>
       </w:r>
       <w:r>
         <w:rPr>
@@ -1363,7 +1352,7 @@
           <w:color w:val="1B2A41"/>
           <w:sz w:val="25"/>
         </w:rPr>
-        <w:t xml:space="preserve"> es un pago único, al principio, por el derecho a entrar a la red. Las </w:t>
+        <w:t xml:space="preserve"> es un pago único al principio por el derecho a entrar en la red, mientras que las </w:t>
       </w:r>
       <w:r>
         <w:rPr>
@@ -1381,7 +1370,7 @@
           <w:color w:val="1B2A41"/>
           <w:sz w:val="25"/>
         </w:rPr>
-        <w:t xml:space="preserve"> son pagos que se repiten cada mes, y normalmente se calculan como un porcentaje de las ventas.</w:t>
+        <w:t xml:space="preserve"> se repiten cada mes y normalmente son un porcentaje de las ventas. Pero además del dinero recibe control, porque puede exigir que el local se vea igual, que se opere igual y que el know-how no salga de ahí.</w:t>
       </w:r>
     </w:p>
     <w:p>
@@ -1392,7 +1381,7 @@
           <w:color w:val="1B2A41"/>
           <w:sz w:val="25"/>
         </w:rPr>
-        <w:t>Y además del dinero recibe control. Puede exigir que el local se vea igual, que se opere igual, y que el know-how no salga de ahí.</w:t>
+        <w:t>Del otro lado, el franquiciado pone el capital y la gestión, es decir la inversión inicial, las regalías, el día a día y el equipo, y aporta además algo que la marca no tiene, porque él sabe cómo compra la gente de su ciudad.</w:t>
       </w:r>
     </w:p>
     <w:p>
@@ -1403,18 +1392,7 @@
           <w:color w:val="1B2A41"/>
           <w:sz w:val="25"/>
         </w:rPr>
-        <w:t>Del otro lado, el franquiciado pone el capital y la gestión: la inversión inicial, las regalías, el día a día, el equipo. Y pone algo que la marca no tiene: sabe cómo compra la gente de su ciudad.</w:t>
-      </w:r>
-    </w:p>
-    <w:p>
-      <w:r>
-        <w:rPr>
-          <w:rFonts w:ascii="Calibri" w:hAnsi="Calibri"/>
-          <w:b w:val="0"/>
-          <w:color w:val="1B2A41"/>
-          <w:sz w:val="25"/>
-        </w:rPr>
-        <w:t xml:space="preserve">A cambio recibe el paquete completo y, sobre todo, protección. La más importante suele ser la </w:t>
+        <w:t xml:space="preserve">Lo que recibe a cambio es protección, y la más importante suele ser la </w:t>
       </w:r>
       <w:r>
         <w:rPr>
@@ -1432,7 +1410,7 @@
           <w:color w:val="1B2A41"/>
           <w:sz w:val="25"/>
         </w:rPr>
-        <w:t>: el compromiso de que la marca no va a abrir otro local en su zona y le va a dividir la clientela. Si no quedó escrito, no existe.</w:t>
+        <w:t>, es decir el compromiso de que la marca no va a abrir otro local en su zona dividiéndole la clientela, aunque si no quedó escrito no existe. Y entre sus obligaciones está no competir con la red mientras el contrato esté vigente.</w:t>
       </w:r>
     </w:p>
     <w:p>
@@ -1443,18 +1421,7 @@
           <w:color w:val="1B2A41"/>
           <w:sz w:val="25"/>
         </w:rPr>
-        <w:t>Entre sus obligaciones está no competir con la red mientras el contrato esté vigente, que es la contracara de haberle recibido el método.</w:t>
-      </w:r>
-    </w:p>
-    <w:p>
-      <w:r>
-        <w:rPr>
-          <w:rFonts w:ascii="Calibri" w:hAnsi="Calibri"/>
-          <w:b w:val="0"/>
-          <w:color w:val="1B2A41"/>
-          <w:sz w:val="25"/>
-        </w:rPr>
-        <w:t xml:space="preserve">Y acá está la confusión más común. Aunque siga manuales ajenos, aunque lo auditen, aunque no fije sus precios, el franquiciado </w:t>
+        <w:t xml:space="preserve">Acá aparece la confusión más común de todas, porque aunque siga manuales ajenos, aunque lo auditen y aunque no fije libremente sus precios, el franquiciado </w:t>
       </w:r>
       <w:r>
         <w:rPr>
@@ -1472,7 +1439,7 @@
           <w:color w:val="1B2A41"/>
           <w:sz w:val="25"/>
         </w:rPr>
-        <w:t>. Es un empresario independiente. Su capital está en riesgo. Si el local quiebra, la pérdida es suya y no de la marca.</w:t>
+        <w:t xml:space="preserve"> sino un empresario independiente, de modo que si el local quiebra la pérdida es suya y no de la marca.</w:t>
       </w:r>
     </w:p>
     <w:p>
@@ -1483,7 +1450,7 @@
           <w:color w:val="1B2A41"/>
           <w:sz w:val="25"/>
         </w:rPr>
-        <w:t>De ahí sale el punto que más se pelea en tribunales: quién responde cuando un cliente sufre un daño dentro del local. En principio responde el franquiciado, incluso por lo que hagan sus empleados, precisamente porque es independiente. Que el aviso de la marca esté en la puerta no alcanza para responsabilizarla. Pero los tribunales españoles hicieron una excepción, sobre todo en clínicas de estética y odontología: si se prueba que el daño vino de una instrucción concreta de la marca, la marca responde. Tener manuales y supervisar no basta.</w:t>
+        <w:t>De esa independencia sale el punto que más se pelea en tribunales, que es quién responde cuando un cliente sufre un daño en el local. En principio responde el franquiciado, y que el aviso de la marca esté en la puerta no alcanza para responsabilizarla. Sin embargo, los tribunales españoles hicieron una excepción en clínicas de estética y odontología, porque si se prueba que el daño vino de una instrucción concreta de la marca entonces la marca sí responde.</w:t>
       </w:r>
     </w:p>
     <w:p>
@@ -1494,7 +1461,7 @@
           <w:color w:val="1B2A41"/>
           <w:sz w:val="25"/>
         </w:rPr>
-        <w:t>Y cuando la red sale al exterior aparece un tercero. Alguien compra los derechos de un país entero y después otorga franquicias ahí adentro. No es el dueño de la marca, pero para esos locales hace de dueño.</w:t>
+        <w:t>Por último, cuando la red sale al exterior aparece un tercero que compra los derechos de un país entero y después otorga franquicias ahí adentro, y aunque no es el dueño de la marca, frente a esos locales actúa como si lo fuera.</w:t>
       </w:r>
     </w:p>
     <w:p>
@@ -1512,7 +1479,7 @@
           <w:color w:val="A8532B"/>
           <w:sz w:val="19"/>
         </w:rPr>
-        <w:t>10:54 – 12:51</w:t>
+        <w:t>10:47 – 12:57</w:t>
       </w:r>
     </w:p>
     <w:p>
@@ -1549,7 +1516,7 @@
           <w:color w:val="1B2A41"/>
           <w:sz w:val="25"/>
         </w:rPr>
-        <w:t>En la diapositiva están los doce puntos; no los voy a leer. Prefiero explicarles la lógica, porque las dos columnas son la misma decisión vista de los dos lados.</w:t>
+        <w:t>En la diapositiva están los doce puntos, así que no los voy a leer uno por uno y prefiero explicarles la lógica de fondo, porque las dos columnas son la misma decisión vista desde lados opuestos.</w:t>
       </w:r>
     </w:p>
     <w:p>
@@ -1560,7 +1527,7 @@
           <w:color w:val="1B2A41"/>
           <w:sz w:val="25"/>
         </w:rPr>
-        <w:t>Lo que se gana son dos cosas. Tiempo: uno no se pone a averiguar qué funciona, entra a algo que ya funciona. Por eso las franquicias sobreviven más que los negocios independientes parecidos; no es suerte, es que los errores caros ya los pagó otro. Y escala: la publicidad, la capacitación y las compras se hacen para toda la red. Un local solo negocia cien unidades, la red negocia cien mil. No les dan el mismo precio ni el mismo plazo de pago.</w:t>
+        <w:t>Lo que se gana se puede resumir en dos cosas. La primera es tiempo, porque uno no se pone a averiguar qué funciona sino que entra a algo que ya funciona, y eso explica que las franquicias sobrevivan más que los negocios independientes parecidos, ya que los errores caros los pagó otro antes. La segunda es escala, porque la publicidad, la capacitación y las compras se hacen para toda la red, así que un local que negocia cien unidades no consigue el mismo precio que una red que negocia cien mil.</w:t>
       </w:r>
     </w:p>
     <w:p>
@@ -1571,7 +1538,7 @@
           <w:color w:val="1B2A41"/>
           <w:sz w:val="25"/>
         </w:rPr>
-        <w:t xml:space="preserve">Lo que se cede son también dos cosas. Se cede margen, y de una forma que hay que entender bien: las regalías se calculan sobre </w:t>
+        <w:t xml:space="preserve">Lo que se cede son también dos cosas. Se cede margen, y de una forma que hay que entender bien, porque las regalías se calculan sobre </w:t>
       </w:r>
       <w:r>
         <w:rPr>
@@ -1580,7 +1547,7 @@
           <w:color w:val="1B2A41"/>
           <w:sz w:val="25"/>
         </w:rPr>
-        <w:t>las ventas, no sobre la ganancia</w:t>
+        <w:t>las ventas y no sobre la ganancia</w:t>
       </w:r>
       <w:r>
         <w:rPr>
@@ -1589,7 +1556,7 @@
           <w:color w:val="1B2A41"/>
           <w:sz w:val="25"/>
         </w:rPr>
-        <w:t>. Si un mes las ventas caen a la mitad, la regalía se paga igual. Un mes malo para el local no es un mes malo para la marca.</w:t>
+        <w:t>, así que si un mes las ventas caen a la mitad la regalía se paga igual y un mes malo para el local no es un mes malo para la marca.</w:t>
       </w:r>
     </w:p>
     <w:p>
@@ -1600,7 +1567,7 @@
           <w:color w:val="1B2A41"/>
           <w:sz w:val="25"/>
         </w:rPr>
-        <w:t>Y se cede autonomía. El franquiciado puede ver una oportunidad real en su mercado y no poder aprovecharla porque el manual no lo permite. Y hay una exposición que no controla en absoluto: si la marca se golpea en su reputación, aunque sea por algo que pasó en otro país, su local pierde clientes esa semana. Pudo haber trabajado impecable y el costo lo asume igual.</w:t>
+        <w:t>Y se cede autonomía, porque el franquiciado puede ver una oportunidad real en su mercado y no poder aprovecharla si el manual no lo permite. Además hay una exposición que no controla en absoluto, ya que si la marca se golpea en su reputación, aunque sea por algo que pasó en otro país, su local pierde clientes esa semana aunque él haya trabajado impecable.</w:t>
       </w:r>
     </w:p>
     <w:p>
@@ -1611,7 +1578,7 @@
           <w:color w:val="1B2A41"/>
           <w:sz w:val="25"/>
         </w:rPr>
-        <w:t>Ahí está el fondo del asunto: lo mismo que le da valor a la red es lo que le quita libertad al franquiciado. No hay uno sin el otro. El contrato solo define dónde se pone esa raya.</w:t>
+        <w:t>Y ahí está el fondo del asunto, porque lo mismo que le da valor a la red es lo que le quita libertad al franquiciado, de manera que no hay uno sin el otro y lo único que hace el contrato es definir dónde se pone esa raya.</w:t>
       </w:r>
     </w:p>
     <w:p>
@@ -1629,7 +1596,7 @@
           <w:color w:val="A8532B"/>
           <w:sz w:val="19"/>
         </w:rPr>
-        <w:t>12:51 – 15:03</w:t>
+        <w:t>12:57 – 15:17</w:t>
       </w:r>
     </w:p>
     <w:p>
@@ -1666,7 +1633,7 @@
           <w:color w:val="1B2A41"/>
           <w:sz w:val="25"/>
         </w:rPr>
-        <w:t>Para cerrar, tres conclusiones.</w:t>
+        <w:t>Para cerrar quiero dejarles tres conclusiones.</w:t>
       </w:r>
     </w:p>
     <w:p>
@@ -1677,7 +1644,7 @@
           <w:color w:val="1B2A41"/>
           <w:sz w:val="25"/>
         </w:rPr>
-        <w:t>La primera:</w:t>
+        <w:t>La primera</w:t>
       </w:r>
       <w:r>
         <w:rPr>
@@ -1686,7 +1653,7 @@
           <w:color w:val="1B2A41"/>
           <w:sz w:val="25"/>
         </w:rPr>
-        <w:t xml:space="preserve"> esto funciona porque ninguna de las dos partes podría sola. Una tiene la marca, el método y la experiencia, pero no el capital ni el conocimiento de cada mercado. La otra tiene el capital y el mercado, pero no la marca ni el método. La franquicia existe para juntar esas dos mitades.</w:t>
+        <w:t xml:space="preserve"> es que esto funciona porque ninguna de las dos partes podría sola, ya que una tiene la marca y el método pero no el capital ni el conocimiento de cada mercado, mientras que la otra tiene el capital y conoce su mercado pero no la marca ni el método.</w:t>
       </w:r>
     </w:p>
     <w:p>
@@ -1697,7 +1664,7 @@
           <w:color w:val="1B2A41"/>
           <w:sz w:val="25"/>
         </w:rPr>
-        <w:t>La segunda,</w:t>
+        <w:t>La segunda</w:t>
       </w:r>
       <w:r>
         <w:rPr>
@@ -1706,7 +1673,7 @@
           <w:color w:val="1B2A41"/>
           <w:sz w:val="25"/>
         </w:rPr>
-        <w:t xml:space="preserve"> y es la que más me llamó la atención al investigar: qué tan expuestas están las partes depende del país. Donde la ley regula la figura hay un mínimo garantizado. Donde no, como en Colombia o Perú, ese mínimo lo pone el contrato o no lo pone nadie. Un contrato mal hecho ahí no es un problema de forma: es quedarse sin defensa.</w:t>
+        <w:t>, y es la que más me llamó la atención, es que qué tan expuestas están las partes depende del país, porque donde la ley regula la figura hay un mínimo garantizado, pero donde no la regula, como en Colombia o en Perú, ese mínimo lo pone el contrato o no lo pone nadie, y por eso un contrato mal hecho ahí no es un problema de forma sino quedarse sin defensa.</w:t>
       </w:r>
     </w:p>
     <w:p>
@@ -1717,7 +1684,7 @@
           <w:color w:val="1B2A41"/>
           <w:sz w:val="25"/>
         </w:rPr>
-        <w:t>La tercera:</w:t>
+        <w:t>Y la tercera</w:t>
       </w:r>
       <w:r>
         <w:rPr>
@@ -1726,7 +1693,7 @@
           <w:color w:val="1B2A41"/>
           <w:sz w:val="25"/>
         </w:rPr>
-        <w:t xml:space="preserve"> la independencia entre las partes es real, pero tiene un límite. Se sostiene mientras la marca oriente. Cuando el control es tan fuerte que reemplaza la decisión del franquiciado, esa independencia deja de existir, y los tribunales ya lo reconocieron.</w:t>
+        <w:t xml:space="preserve"> es que la independencia entre las partes es real aunque tiene un límite, porque se sostiene mientras la marca oriente, y cuando el control se vuelve tan fuerte que reemplaza la decisión del franquiciado esa independencia deja de existir.</w:t>
       </w:r>
     </w:p>
     <w:p>
@@ -1737,7 +1704,7 @@
           <w:color w:val="1B2A41"/>
           <w:sz w:val="25"/>
         </w:rPr>
-        <w:t xml:space="preserve">Todo esto es teoría. Para contrastarlo con la práctica entrevistamos a </w:t>
+        <w:t xml:space="preserve">Ahora, todo esto sigue siendo teoría, así que para contrastarlo entrevistamos a </w:t>
       </w:r>
       <w:r>
         <w:rPr>
@@ -1755,7 +1722,7 @@
           <w:color w:val="1B2A41"/>
           <w:sz w:val="25"/>
         </w:rPr>
-        <w:t>, vicepresidente de operaciones de Grupo David. Lleva veinte años ahí y hoy responde por más de cuarenta franquicias.</w:t>
+        <w:t>, vicepresidente de operaciones de Grupo David, que lleva veinte años ahí y hoy responde por más de cuarenta franquicias.</w:t>
       </w:r>
     </w:p>
     <w:p>
@@ -1766,7 +1733,7 @@
           <w:color w:val="1B2A41"/>
           <w:sz w:val="25"/>
         </w:rPr>
-        <w:t xml:space="preserve">Antes de verlo, dos términos que él usa. </w:t>
+        <w:t xml:space="preserve">Antes de ver el video quiero aclararles dos términos que él usa. Cuando habla de </w:t>
       </w:r>
       <w:r>
         <w:rPr>
@@ -1775,7 +1742,7 @@
           <w:color w:val="1B2A41"/>
           <w:sz w:val="25"/>
         </w:rPr>
-        <w:t>Brand awareness</w:t>
+        <w:t>brand awareness</w:t>
       </w:r>
       <w:r>
         <w:rPr>
@@ -1784,7 +1751,7 @@
           <w:color w:val="1B2A41"/>
           <w:sz w:val="25"/>
         </w:rPr>
-        <w:t xml:space="preserve"> es qué tanto una marca es conocida y deseada en un mercado; para él eso define si se abre o no se abre un local. Y </w:t>
+        <w:t xml:space="preserve"> se refiere a qué tanto una marca es conocida y deseada en un mercado, y para él eso define si se abre o no un local, mientras que </w:t>
       </w:r>
       <w:r>
         <w:rPr>
@@ -1802,7 +1769,7 @@
           <w:color w:val="1B2A41"/>
           <w:sz w:val="25"/>
         </w:rPr>
-        <w:t xml:space="preserve"> es adaptar el producto a cada mercado: cambiar telas, colores y surtido según el clima y lo que la gente usa. Su ejemplo lo resume bien: mandar ropa de invierno a una ciudad cálida es perder la temporada entera.</w:t>
+        <w:t xml:space="preserve"> es adaptar el producto a cada mercado, o sea cambiar telas, colores y surtido según el clima y lo que la gente usa. Su ejemplo lo resume bien, porque mandar ropa de invierno a una ciudad cálida es perder la temporada.</w:t>
       </w:r>
     </w:p>
     <w:p>
@@ -1813,7 +1780,7 @@
           <w:color w:val="1B2A41"/>
           <w:sz w:val="25"/>
         </w:rPr>
-        <w:t>Presten atención sobre todo a una cosa: hasta dónde se puede adaptar el modelo sin romper el estándar. Lo que acá suena abstracto, para él es una decisión de todos los días.</w:t>
+        <w:t>Presten atención sobre todo a hasta dónde se puede adaptar el modelo sin romper el estándar, porque lo que acá suena abstracto para él es una decisión de todos los días.</w:t>
       </w:r>
     </w:p>
     <w:p>
@@ -1879,7 +1846,7 @@
           <w:color w:val="1B2A41"/>
           <w:sz w:val="25"/>
         </w:rPr>
-        <w:t>La entrevista deja clara una cosa que en el análisis apenas se asoma: lo que sostiene una franquicia no es el texto del contrato, sino el rigor con que se repite el estándar y el criterio con que se adapta a cada mercado. Con gusto respondo sus preguntas.</w:t>
+        <w:t>La entrevista deja clara una cosa que en el análisis apenas se asoma, y es que lo que sostiene una franquicia no es el texto del contrato sino el rigor con que se repite el estándar y el criterio con que se adapta a cada mercado. Con gusto respondo sus preguntas.</w:t>
       </w:r>
     </w:p>
     <w:p>
@@ -1917,7 +1884,7 @@
           <w:color w:val="445570"/>
           <w:sz w:val="23"/>
         </w:rPr>
-        <w:t>Depende del sector y de qué tan fuerte sea la marca, pero la estructura es siempre la misma: un canon de entrada, que es único y al principio, y regalías mensuales, que normalmente son un porcentaje de las ventas.</w:t>
+        <w:t>Depende del sector y de qué tan fuerte sea la marca, pero la estructura es siempre la misma, porque hay un canon de entrada que es único y se paga al principio, y luego regalías mensuales que normalmente son un porcentaje de las ventas.</w:t>
       </w:r>
     </w:p>
     <w:p>
@@ -1942,7 +1909,7 @@
           <w:color w:val="445570"/>
           <w:sz w:val="23"/>
         </w:rPr>
-        <w:t>Solo con autorización de la marca, y así queda escrito casi siempre. La marca quiere decidir quién entra a su red.</w:t>
+        <w:t>Solo con autorización de la marca, y así queda escrito casi siempre, porque la marca quiere decidir quién entra a su red.</w:t>
       </w:r>
     </w:p>
     <w:p>
@@ -1967,7 +1934,7 @@
           <w:color w:val="445570"/>
           <w:sz w:val="23"/>
         </w:rPr>
-        <w:t>En principio el franquiciado, porque es un empresario independiente. Los tribunales españoles han responsabilizado a la marca cuando se prueba que el daño vino de una instrucción concreta que ella dio. Tener estándares de calidad no basta: hay que probar que esa orden causó el daño.</w:t>
+        <w:t>En principio el franquiciado, porque es un empresario independiente. Los tribunales españoles han responsabilizado a la marca cuando se prueba que el daño vino de una instrucción concreta que ella dio, así que tener estándares de calidad no basta y hay que probar que esa orden causó el daño.</w:t>
       </w:r>
     </w:p>
     <w:p>
@@ -1992,7 +1959,7 @@
           <w:color w:val="445570"/>
           <w:sz w:val="23"/>
         </w:rPr>
-        <w:t>Necesita autorización. Un laudo arbitral colombiano, el caso PANACA, dejó dicho que el franquiciado debe respetar la filosofía de la marca, pero que los manuales tampoco se pueden aplicar igual en cualquier ciudad.</w:t>
+        <w:t>Necesita autorización. Un laudo arbitral colombiano, el caso PANACA, dejó dicho que el franquiciado debe respetar la filosofía de la marca, aunque también aclaró que los manuales no se pueden aplicar igual en cualquier ciudad.</w:t>
       </w:r>
     </w:p>
     <w:p>
@@ -2017,7 +1984,7 @@
           <w:color w:val="445570"/>
           <w:sz w:val="23"/>
         </w:rPr>
-        <w:t>La licencia solo autoriza usar el nombre. La franquicia entrega además el know-how, los manuales, la capacitación y la asistencia continua, y viene con control sobre cómo se opera.</w:t>
+        <w:t>La licencia solo autoriza usar el nombre, mientras que la franquicia entrega además el know-how, los manuales, la capacitación y la asistencia continua, y viene con control sobre cómo se opera.</w:t>
       </w:r>
     </w:p>
     <w:p>
@@ -2042,7 +2009,7 @@
           <w:color w:val="445570"/>
           <w:sz w:val="23"/>
         </w:rPr>
-        <w:t>Hay una norma técnica voluntaria, la NTC 5813, y el Ministerio de Comercio redactó en 2021 un proyecto de decreto que incluía ese plazo de veinte días. Cuando hicimos la revisión seguía sin expedirse.</w:t>
+        <w:t>Hay una norma técnica voluntaria, la NTC 5813, y el Ministerio de Comercio redactó en 2021 un proyecto de decreto que incluía ese plazo de veinte días, pero cuando hicimos la revisión seguía sin expedirse.</w:t>
       </w:r>
     </w:p>
     <w:p>
@@ -2067,7 +2034,7 @@
           <w:color w:val="445570"/>
           <w:sz w:val="23"/>
         </w:rPr>
-        <w:t>Lo fija el contrato y cambia según el sector, pero siempre trae cláusulas de renovación y de terminación. Es una relación de largo plazo, y por eso la salida se negocia desde el principio.</w:t>
+        <w:t>Lo fija el contrato y cambia según el sector, aunque siempre trae cláusulas de renovación y de terminación, porque es una relación de largo plazo y por eso la salida se negocia desde el principio.</w:t>
       </w:r>
     </w:p>
     <w:sectPr>

</xml_diff>